<commit_message>
Raport 1.2: naprawa stylistyki i spojnosci wydania
Sekcje dopisane po wydaniu 1.0 mialy srednio 323 znaki na akapit i zero tabel,
podczas gdy dokument operuje akapitami po ~103 znaki, tabelami i blokami
wyroznionymi. Przepisane wzorcami z rozdzialu 8.2: 5 tabel, 3 bloki w ramkach,
srednia dlugosc akapitu 128 znakow.

Dodany rozdzial "Historia dokumentu" z tabela trzech wydan - dokument czyta sie
jako kolejne wydanie tego samego opracowania.

Usuniete sprzecznosci wewnetrzne, w ktorych wydanie 1.0 przeczylo pomiarom:
- mediana 0,49 ms w streszczeniu wobec 4 ms w rozdziale 8.6
- PostgreSQL 16/16.13 zamiast 17/17.5, na ktorym weryfikowano
- 11 punktow koncowych zamiast 12
- naklad 5-7 tygodni bez wersjonowania, audytu i monitorowania
</commit_message>
<xml_diff>
--- a/docs/raport-baza-mikroserwis-v1.2.docx
+++ b/docs/raport-baza-mikroserwis-v1.2.docx
@@ -308,6 +308,361 @@
         <w:spacing w:after="180" w:before="360"/>
       </w:pPr>
       <w:r>
+        <w:t xml:space="preserve">Historia dokumentu</w:t>
+      </w:r>
+    </w:p>
+    <w:p>
+      <w:pPr>
+        <w:spacing w:after="120" w:line="276"/>
+      </w:pPr>
+      <w:r>
+        <w:rPr>
+          <w:sz w:val="21"/>
+          <w:szCs w:val="21"/>
+        </w:rPr>
+        <w:t xml:space="preserve">Niniejsze opracowanie jest kolejnym wydaniem raportu z 5 sierpnia 2026. Struktura i wnioski pozostają, zmienia się podstawa dowodowa: wyniki z próbek zostały zastąpione pomiarami na rzeczywistych danych rejestru.</w:t>
+      </w:r>
+    </w:p>
+    <w:tbl>
+      <w:tblPr>
+        <w:tblW w:type="dxa" w:w="9026"/>
+        <w:tblBorders>
+          <w:top w:val="single" w:color="auto" w:sz="4"/>
+          <w:left w:val="single" w:color="auto" w:sz="4"/>
+          <w:bottom w:val="single" w:color="auto" w:sz="4"/>
+          <w:right w:val="single" w:color="auto" w:sz="4"/>
+          <w:insideH w:val="single" w:color="auto" w:sz="4"/>
+          <w:insideV w:val="single" w:color="auto" w:sz="4"/>
+        </w:tblBorders>
+      </w:tblPr>
+      <w:tblGrid>
+        <w:gridCol w:w="1100"/>
+        <w:gridCol w:w="1500"/>
+        <w:gridCol w:w="6426"/>
+      </w:tblGrid>
+      <w:tr>
+        <w:trPr>
+          <w:tblHeader/>
+        </w:trPr>
+        <w:tc>
+          <w:tcPr>
+            <w:tcW w:type="dxa" w:w="1100"/>
+            <w:shd w:fill="E8EDF2" w:color="auto" w:val="clear"/>
+            <w:tcMar>
+              <w:top w:type="dxa" w:w="70"/>
+              <w:left w:type="dxa" w:w="110"/>
+              <w:bottom w:type="dxa" w:w="70"/>
+              <w:right w:type="dxa" w:w="110"/>
+            </w:tcMar>
+            <w:vAlign w:val="center"/>
+          </w:tcPr>
+          <w:p>
+            <w:pPr>
+              <w:spacing w:after="0" w:line="240"/>
+            </w:pPr>
+            <w:r>
+              <w:rPr>
+                <w:b/>
+                <w:bCs/>
+                <w:sz w:val="19"/>
+                <w:szCs w:val="19"/>
+              </w:rPr>
+              <w:t xml:space="preserve">Wydanie</w:t>
+            </w:r>
+          </w:p>
+        </w:tc>
+        <w:tc>
+          <w:tcPr>
+            <w:tcW w:type="dxa" w:w="1500"/>
+            <w:shd w:fill="E8EDF2" w:color="auto" w:val="clear"/>
+            <w:tcMar>
+              <w:top w:type="dxa" w:w="70"/>
+              <w:left w:type="dxa" w:w="110"/>
+              <w:bottom w:type="dxa" w:w="70"/>
+              <w:right w:type="dxa" w:w="110"/>
+            </w:tcMar>
+            <w:vAlign w:val="center"/>
+          </w:tcPr>
+          <w:p>
+            <w:pPr>
+              <w:spacing w:after="0" w:line="240"/>
+            </w:pPr>
+            <w:r>
+              <w:rPr>
+                <w:b/>
+                <w:bCs/>
+                <w:sz w:val="19"/>
+                <w:szCs w:val="19"/>
+              </w:rPr>
+              <w:t xml:space="preserve">Data</w:t>
+            </w:r>
+          </w:p>
+        </w:tc>
+        <w:tc>
+          <w:tcPr>
+            <w:tcW w:type="dxa" w:w="6426"/>
+            <w:shd w:fill="E8EDF2" w:color="auto" w:val="clear"/>
+            <w:tcMar>
+              <w:top w:type="dxa" w:w="70"/>
+              <w:left w:type="dxa" w:w="110"/>
+              <w:bottom w:type="dxa" w:w="70"/>
+              <w:right w:type="dxa" w:w="110"/>
+            </w:tcMar>
+            <w:vAlign w:val="center"/>
+          </w:tcPr>
+          <w:p>
+            <w:pPr>
+              <w:spacing w:after="0" w:line="240"/>
+            </w:pPr>
+            <w:r>
+              <w:rPr>
+                <w:b/>
+                <w:bCs/>
+                <w:sz w:val="19"/>
+                <w:szCs w:val="19"/>
+              </w:rPr>
+              <w:t xml:space="preserve">Co przyniosło</w:t>
+            </w:r>
+          </w:p>
+        </w:tc>
+      </w:tr>
+      <w:tr>
+        <w:tc>
+          <w:tcPr>
+            <w:tcW w:type="dxa" w:w="1100"/>
+            <w:tcMar>
+              <w:top w:type="dxa" w:w="70"/>
+              <w:left w:type="dxa" w:w="110"/>
+              <w:bottom w:type="dxa" w:w="70"/>
+              <w:right w:type="dxa" w:w="110"/>
+            </w:tcMar>
+          </w:tcPr>
+          <w:p>
+            <w:pPr>
+              <w:spacing w:after="0" w:line="240"/>
+            </w:pPr>
+            <w:r>
+              <w:rPr>
+                <w:sz w:val="19"/>
+                <w:szCs w:val="19"/>
+              </w:rPr>
+              <w:t xml:space="preserve">1.0</w:t>
+            </w:r>
+          </w:p>
+        </w:tc>
+        <w:tc>
+          <w:tcPr>
+            <w:tcW w:type="dxa" w:w="1500"/>
+            <w:tcMar>
+              <w:top w:type="dxa" w:w="70"/>
+              <w:left w:type="dxa" w:w="110"/>
+              <w:bottom w:type="dxa" w:w="70"/>
+              <w:right w:type="dxa" w:w="110"/>
+            </w:tcMar>
+          </w:tcPr>
+          <w:p>
+            <w:pPr>
+              <w:spacing w:after="0" w:line="240"/>
+            </w:pPr>
+            <w:r>
+              <w:rPr>
+                <w:sz w:val="19"/>
+                <w:szCs w:val="19"/>
+              </w:rPr>
+              <w:t xml:space="preserve">5.08.2026</w:t>
+            </w:r>
+          </w:p>
+        </w:tc>
+        <w:tc>
+          <w:tcPr>
+            <w:tcW w:type="dxa" w:w="6426"/>
+            <w:tcMar>
+              <w:top w:type="dxa" w:w="70"/>
+              <w:left w:type="dxa" w:w="110"/>
+              <w:bottom w:type="dxa" w:w="70"/>
+              <w:right w:type="dxa" w:w="110"/>
+            </w:tcMar>
+          </w:tcPr>
+          <w:p>
+            <w:pPr>
+              <w:spacing w:after="0" w:line="240"/>
+            </w:pPr>
+            <w:r>
+              <w:rPr>
+                <w:sz w:val="19"/>
+                <w:szCs w:val="19"/>
+              </w:rPr>
+              <w:t xml:space="preserve">Analiza źródeł, architektura, warianty rozwiązania, kalendarz ryzyk. Wyniki z fixture’ów i zbiorów syntetycznych</w:t>
+            </w:r>
+          </w:p>
+        </w:tc>
+      </w:tr>
+      <w:tr>
+        <w:tc>
+          <w:tcPr>
+            <w:tcW w:type="dxa" w:w="1100"/>
+            <w:tcMar>
+              <w:top w:type="dxa" w:w="70"/>
+              <w:left w:type="dxa" w:w="110"/>
+              <w:bottom w:type="dxa" w:w="70"/>
+              <w:right w:type="dxa" w:w="110"/>
+            </w:tcMar>
+          </w:tcPr>
+          <w:p>
+            <w:pPr>
+              <w:spacing w:after="0" w:line="240"/>
+            </w:pPr>
+            <w:r>
+              <w:rPr>
+                <w:sz w:val="19"/>
+                <w:szCs w:val="19"/>
+              </w:rPr>
+              <w:t xml:space="preserve">1.1</w:t>
+            </w:r>
+          </w:p>
+        </w:tc>
+        <w:tc>
+          <w:tcPr>
+            <w:tcW w:type="dxa" w:w="1500"/>
+            <w:tcMar>
+              <w:top w:type="dxa" w:w="70"/>
+              <w:left w:type="dxa" w:w="110"/>
+              <w:bottom w:type="dxa" w:w="70"/>
+              <w:right w:type="dxa" w:w="110"/>
+            </w:tcMar>
+          </w:tcPr>
+          <w:p>
+            <w:pPr>
+              <w:spacing w:after="0" w:line="240"/>
+            </w:pPr>
+            <w:r>
+              <w:rPr>
+                <w:sz w:val="19"/>
+                <w:szCs w:val="19"/>
+              </w:rPr>
+              <w:t xml:space="preserve">6.08.2026</w:t>
+            </w:r>
+          </w:p>
+        </w:tc>
+        <w:tc>
+          <w:tcPr>
+            <w:tcW w:type="dxa" w:w="6426"/>
+            <w:tcMar>
+              <w:top w:type="dxa" w:w="70"/>
+              <w:left w:type="dxa" w:w="110"/>
+              <w:bottom w:type="dxa" w:w="70"/>
+              <w:right w:type="dxa" w:w="110"/>
+            </w:tcMar>
+          </w:tcPr>
+          <w:p>
+            <w:pPr>
+              <w:spacing w:after="0" w:line="240"/>
+            </w:pPr>
+            <w:r>
+              <w:rPr>
+                <w:sz w:val="19"/>
+                <w:szCs w:val="19"/>
+              </w:rPr>
+              <w:t xml:space="preserve">Komplet archiwum PRG (16 województw), słowniki TERYT pobrane bez konta w GUS, potwierdzenie nowej struktury danych na rzeczywistym pliku. Rozstrzygnięte dwa z czterech pytań otwartych</w:t>
+            </w:r>
+          </w:p>
+        </w:tc>
+      </w:tr>
+      <w:tr>
+        <w:tc>
+          <w:tcPr>
+            <w:tcW w:type="dxa" w:w="1100"/>
+            <w:tcMar>
+              <w:top w:type="dxa" w:w="70"/>
+              <w:left w:type="dxa" w:w="110"/>
+              <w:bottom w:type="dxa" w:w="70"/>
+              <w:right w:type="dxa" w:w="110"/>
+            </w:tcMar>
+          </w:tcPr>
+          <w:p>
+            <w:pPr>
+              <w:spacing w:after="0" w:line="240"/>
+            </w:pPr>
+            <w:r>
+              <w:rPr>
+                <w:sz w:val="19"/>
+                <w:szCs w:val="19"/>
+              </w:rPr>
+              <w:t xml:space="preserve">1.2</w:t>
+            </w:r>
+          </w:p>
+        </w:tc>
+        <w:tc>
+          <w:tcPr>
+            <w:tcW w:type="dxa" w:w="1500"/>
+            <w:tcMar>
+              <w:top w:type="dxa" w:w="70"/>
+              <w:left w:type="dxa" w:w="110"/>
+              <w:bottom w:type="dxa" w:w="70"/>
+              <w:right w:type="dxa" w:w="110"/>
+            </w:tcMar>
+          </w:tcPr>
+          <w:p>
+            <w:pPr>
+              <w:spacing w:after="0" w:line="240"/>
+            </w:pPr>
+            <w:r>
+              <w:rPr>
+                <w:sz w:val="19"/>
+                <w:szCs w:val="19"/>
+              </w:rPr>
+              <w:t xml:space="preserve">7.08.2026</w:t>
+            </w:r>
+          </w:p>
+        </w:tc>
+        <w:tc>
+          <w:tcPr>
+            <w:tcW w:type="dxa" w:w="6426"/>
+            <w:tcMar>
+              <w:top w:type="dxa" w:w="70"/>
+              <w:left w:type="dxa" w:w="110"/>
+              <w:bottom w:type="dxa" w:w="70"/>
+              <w:right w:type="dxa" w:w="110"/>
+            </w:tcMar>
+          </w:tcPr>
+          <w:p>
+            <w:pPr>
+              <w:spacing w:after="0" w:line="240"/>
+            </w:pPr>
+            <w:r>
+              <w:rPr>
+                <w:sz w:val="19"/>
+                <w:szCs w:val="19"/>
+              </w:rPr>
+              <w:t xml:space="preserve">Publikacja 1 990 483 punktów, pięć usterek wykrytych na pełnym zbiorze, sprostowanie czasu pełnego przebiegu i czasów odpowiedzi</w:t>
+            </w:r>
+          </w:p>
+        </w:tc>
+      </w:tr>
+    </w:tbl>
+    <w:p>
+      <w:pPr>
+        <w:spacing w:after="160"/>
+      </w:pPr>
+    </w:p>
+    <w:p>
+      <w:pPr>
+        <w:spacing w:after="120" w:line="276"/>
+      </w:pPr>
+      <w:r>
+        <w:rPr>
+          <w:sz w:val="21"/>
+          <w:szCs w:val="21"/>
+        </w:rPr>
+        <w:t xml:space="preserve">Zmiany merytoryczne względem wydania 1.0 zebrano w rozdziałach 8.3–8.6. Dwa wcześniejsze szacunki zostały skorygowane w dół pod wpływem pomiarów — zaznaczono to wprost w treści.</w:t>
+      </w:r>
+    </w:p>
+    <w:p>
+      <w:pPr>
+        <w:pStyle w:val="Heading1"/>
+        <w:spacing w:after="180" w:before="360"/>
+      </w:pPr>
+      <w:r>
         <w:t xml:space="preserve">1. Streszczenie zarządcze</w:t>
       </w:r>
     </w:p>
@@ -341,7 +696,7 @@
           <w:sz w:val="21"/>
           <w:szCs w:val="21"/>
         </w:rPr>
-        <w:t xml:space="preserve">Zbudowano i przetestowano end-to-end kompletny rdzeń rozwiązania: pobieranie danych z rejestru państwowego, przetwarzanie, bazę danych, mechanizm publikacji z kontrolami jakości oraz mikroserwis HTTP. Całość zweryfikowano na działającej instancji PostgreSQL 16 z rozszerzeniem PostGIS.</w:t>
+        <w:t xml:space="preserve">Zbudowano i przetestowano end-to-end kompletny rdzeń rozwiązania: pobieranie danych z rejestru państwowego, przetwarzanie, bazę danych, mechanizm publikacji z kontrolami jakości oraz mikroserwis HTTP. Całość zweryfikowano na działającej instancji PostgreSQL 17 z rozszerzeniem PostGIS.</w:t>
       </w:r>
     </w:p>
     <w:tbl>
@@ -827,7 +1182,7 @@
                 <w:sz w:val="19"/>
                 <w:szCs w:val="19"/>
               </w:rPr>
-              <w:t xml:space="preserve">Zmierzona mediana 0,49 ms</w:t>
+              <w:t xml:space="preserve">Mediana 4 ms na danych rzeczywistych — patrz 8.6</w:t>
             </w:r>
           </w:p>
         </w:tc>
@@ -904,7 +1259,7 @@
                 <w:sz w:val="19"/>
                 <w:szCs w:val="19"/>
               </w:rPr>
-              <w:t xml:space="preserve">11 punktów końcowych</w:t>
+              <w:t xml:space="preserve">12 punktów końcowych</w:t>
             </w:r>
           </w:p>
         </w:tc>
@@ -1309,7 +1664,7 @@
           <w:sz w:val="21"/>
           <w:szCs w:val="21"/>
         </w:rPr>
-        <w:t xml:space="preserve">Szacowany nakład do wersji produkcyjnej: 5–7 tygodni pracy jednej osoby. Nie zawiera prac po stronie interfejsu użytkownika, które są przedmiotem odrębnego opracowania.</w:t>
+        <w:t xml:space="preserve">Szacowany nakład do wersji produkcyjnej: 7,5–10 tygodni pracy jednej osoby na sam back-end, po uwzględnieniu wersjonowania wydań, audytu zmian i monitorowania. Panel administracyjny doliczany osobno. Nie zawiera prac po stronie interfejsu użytkownika, które są przedmiotem odrębnego opracowania.</w:t>
       </w:r>
     </w:p>
     <w:p>
@@ -8819,7 +9174,7 @@
           <w:sz w:val="21"/>
           <w:szCs w:val="21"/>
         </w:rPr>
-        <w:t xml:space="preserve">Całą ścieżkę przetestowano na działającej instancji PostgreSQL 16.13 z PostGIS 3, dla obu struktur danych źródłowych — dotychczasowej i obowiązującej od września.</w:t>
+        <w:t xml:space="preserve">Całą ścieżkę przetestowano na działającej instancji PostgreSQL 17.5 z PostGIS 3.5, dla obu struktur danych źródłowych — dotychczasowej i obowiązującej od września.</w:t>
       </w:r>
     </w:p>
     <w:tbl>
@@ -10207,7 +10562,7 @@
         <w:spacing w:after="140" w:before="280"/>
       </w:pPr>
       <w:r>
-        <w:t xml:space="preserve">8.3. Uruchomienie na danych rzeczywistych — 6 sierpnia 2026</w:t>
+        <w:t xml:space="preserve">8.3. Uruchomienie na danych rzeczywistych</w:t>
       </w:r>
     </w:p>
     <w:p>
@@ -10219,8 +10574,377 @@
           <w:sz w:val="21"/>
           <w:szCs w:val="21"/>
         </w:rPr>
-        <w:t xml:space="preserve">Dotychczasowe wyniki pochodziły z próbek i zbiorów syntetycznych. 6 sierpnia 2026 cała ścieżka została uruchomiona na rzeczywistych danych rejestru PRG i rejestru TERYT. Poniżej wyniki oraz usterki, które ujawniło dopiero zetknięcie z pełnym zbiorem.</w:t>
-      </w:r>
+        <w:t xml:space="preserve">Dotychczasowe wyniki pochodziły z próbek i zbiorów syntetycznych. 6 sierpnia 2026 cała ścieżka przeszła na rzeczywistych danych PRG i TERYT.</w:t>
+      </w:r>
+    </w:p>
+    <w:tbl>
+      <w:tblPr>
+        <w:tblW w:type="dxa" w:w="9026"/>
+        <w:tblBorders>
+          <w:top w:val="single" w:color="auto" w:sz="4"/>
+          <w:left w:val="single" w:color="auto" w:sz="4"/>
+          <w:bottom w:val="single" w:color="auto" w:sz="4"/>
+          <w:right w:val="single" w:color="auto" w:sz="4"/>
+          <w:insideH w:val="single" w:color="auto" w:sz="4"/>
+          <w:insideV w:val="single" w:color="auto" w:sz="4"/>
+        </w:tblBorders>
+      </w:tblPr>
+      <w:tblGrid>
+        <w:gridCol w:w="3400"/>
+        <w:gridCol w:w="5626"/>
+      </w:tblGrid>
+      <w:tr>
+        <w:trPr>
+          <w:tblHeader/>
+        </w:trPr>
+        <w:tc>
+          <w:tcPr>
+            <w:tcW w:type="dxa" w:w="3400"/>
+            <w:shd w:fill="E8EDF2" w:color="auto" w:val="clear"/>
+            <w:tcMar>
+              <w:top w:type="dxa" w:w="70"/>
+              <w:left w:type="dxa" w:w="110"/>
+              <w:bottom w:type="dxa" w:w="70"/>
+              <w:right w:type="dxa" w:w="110"/>
+            </w:tcMar>
+            <w:vAlign w:val="center"/>
+          </w:tcPr>
+          <w:p>
+            <w:pPr>
+              <w:spacing w:after="0" w:line="240"/>
+            </w:pPr>
+            <w:r>
+              <w:rPr>
+                <w:b/>
+                <w:bCs/>
+                <w:sz w:val="19"/>
+                <w:szCs w:val="19"/>
+              </w:rPr>
+              <w:t xml:space="preserve">Element</w:t>
+            </w:r>
+          </w:p>
+        </w:tc>
+        <w:tc>
+          <w:tcPr>
+            <w:tcW w:type="dxa" w:w="5626"/>
+            <w:shd w:fill="E8EDF2" w:color="auto" w:val="clear"/>
+            <w:tcMar>
+              <w:top w:type="dxa" w:w="70"/>
+              <w:left w:type="dxa" w:w="110"/>
+              <w:bottom w:type="dxa" w:w="70"/>
+              <w:right w:type="dxa" w:w="110"/>
+            </w:tcMar>
+            <w:vAlign w:val="center"/>
+          </w:tcPr>
+          <w:p>
+            <w:pPr>
+              <w:spacing w:after="0" w:line="240"/>
+            </w:pPr>
+            <w:r>
+              <w:rPr>
+                <w:b/>
+                <w:bCs/>
+                <w:sz w:val="19"/>
+                <w:szCs w:val="19"/>
+              </w:rPr>
+              <w:t xml:space="preserve">Wynik</w:t>
+            </w:r>
+          </w:p>
+        </w:tc>
+      </w:tr>
+      <w:tr>
+        <w:tc>
+          <w:tcPr>
+            <w:tcW w:type="dxa" w:w="3400"/>
+            <w:tcMar>
+              <w:top w:type="dxa" w:w="70"/>
+              <w:left w:type="dxa" w:w="110"/>
+              <w:bottom w:type="dxa" w:w="70"/>
+              <w:right w:type="dxa" w:w="110"/>
+            </w:tcMar>
+          </w:tcPr>
+          <w:p>
+            <w:pPr>
+              <w:spacing w:after="0" w:line="240"/>
+            </w:pPr>
+            <w:r>
+              <w:rPr>
+                <w:sz w:val="19"/>
+                <w:szCs w:val="19"/>
+              </w:rPr>
+              <w:t xml:space="preserve">Punkty adresowe opublikowane</w:t>
+            </w:r>
+          </w:p>
+        </w:tc>
+        <w:tc>
+          <w:tcPr>
+            <w:tcW w:type="dxa" w:w="5626"/>
+            <w:tcMar>
+              <w:top w:type="dxa" w:w="70"/>
+              <w:left w:type="dxa" w:w="110"/>
+              <w:bottom w:type="dxa" w:w="70"/>
+              <w:right w:type="dxa" w:w="110"/>
+            </w:tcMar>
+          </w:tcPr>
+          <w:p>
+            <w:pPr>
+              <w:spacing w:after="0" w:line="240"/>
+            </w:pPr>
+            <w:r>
+              <w:rPr>
+                <w:sz w:val="19"/>
+                <w:szCs w:val="19"/>
+              </w:rPr>
+              <w:t xml:space="preserve">1 990 483</w:t>
+            </w:r>
+          </w:p>
+        </w:tc>
+      </w:tr>
+      <w:tr>
+        <w:tc>
+          <w:tcPr>
+            <w:tcW w:type="dxa" w:w="3400"/>
+            <w:tcMar>
+              <w:top w:type="dxa" w:w="70"/>
+              <w:left w:type="dxa" w:w="110"/>
+              <w:bottom w:type="dxa" w:w="70"/>
+              <w:right w:type="dxa" w:w="110"/>
+            </w:tcMar>
+          </w:tcPr>
+          <w:p>
+            <w:pPr>
+              <w:spacing w:after="0" w:line="240"/>
+            </w:pPr>
+            <w:r>
+              <w:rPr>
+                <w:sz w:val="19"/>
+                <w:szCs w:val="19"/>
+              </w:rPr>
+              <w:t xml:space="preserve">Punkty z przypisaną ulicą</w:t>
+            </w:r>
+          </w:p>
+        </w:tc>
+        <w:tc>
+          <w:tcPr>
+            <w:tcW w:type="dxa" w:w="5626"/>
+            <w:tcMar>
+              <w:top w:type="dxa" w:w="70"/>
+              <w:left w:type="dxa" w:w="110"/>
+              <w:bottom w:type="dxa" w:w="70"/>
+              <w:right w:type="dxa" w:w="110"/>
+            </w:tcMar>
+          </w:tcPr>
+          <w:p>
+            <w:pPr>
+              <w:spacing w:after="0" w:line="240"/>
+            </w:pPr>
+            <w:r>
+              <w:rPr>
+                <w:sz w:val="19"/>
+                <w:szCs w:val="19"/>
+              </w:rPr>
+              <w:t xml:space="preserve">1 324 563 — 100% tych, które miały odwołanie</w:t>
+            </w:r>
+          </w:p>
+        </w:tc>
+      </w:tr>
+      <w:tr>
+        <w:tc>
+          <w:tcPr>
+            <w:tcW w:type="dxa" w:w="3400"/>
+            <w:tcMar>
+              <w:top w:type="dxa" w:w="70"/>
+              <w:left w:type="dxa" w:w="110"/>
+              <w:bottom w:type="dxa" w:w="70"/>
+              <w:right w:type="dxa" w:w="110"/>
+            </w:tcMar>
+          </w:tcPr>
+          <w:p>
+            <w:pPr>
+              <w:spacing w:after="0" w:line="240"/>
+            </w:pPr>
+            <w:r>
+              <w:rPr>
+                <w:sz w:val="19"/>
+                <w:szCs w:val="19"/>
+              </w:rPr>
+              <w:t xml:space="preserve">Miejscowości w słowniku</w:t>
+            </w:r>
+          </w:p>
+        </w:tc>
+        <w:tc>
+          <w:tcPr>
+            <w:tcW w:type="dxa" w:w="5626"/>
+            <w:tcMar>
+              <w:top w:type="dxa" w:w="70"/>
+              <w:left w:type="dxa" w:w="110"/>
+              <w:bottom w:type="dxa" w:w="70"/>
+              <w:right w:type="dxa" w:w="110"/>
+            </w:tcMar>
+          </w:tcPr>
+          <w:p>
+            <w:pPr>
+              <w:spacing w:after="0" w:line="240"/>
+            </w:pPr>
+            <w:r>
+              <w:rPr>
+                <w:sz w:val="19"/>
+                <w:szCs w:val="19"/>
+              </w:rPr>
+              <w:t xml:space="preserve">101 865</w:t>
+            </w:r>
+          </w:p>
+        </w:tc>
+      </w:tr>
+      <w:tr>
+        <w:tc>
+          <w:tcPr>
+            <w:tcW w:type="dxa" w:w="3400"/>
+            <w:tcMar>
+              <w:top w:type="dxa" w:w="70"/>
+              <w:left w:type="dxa" w:w="110"/>
+              <w:bottom w:type="dxa" w:w="70"/>
+              <w:right w:type="dxa" w:w="110"/>
+            </w:tcMar>
+          </w:tcPr>
+          <w:p>
+            <w:pPr>
+              <w:spacing w:after="0" w:line="240"/>
+            </w:pPr>
+            <w:r>
+              <w:rPr>
+                <w:sz w:val="19"/>
+                <w:szCs w:val="19"/>
+              </w:rPr>
+              <w:t xml:space="preserve">Ulice w katalogu</w:t>
+            </w:r>
+          </w:p>
+        </w:tc>
+        <w:tc>
+          <w:tcPr>
+            <w:tcW w:type="dxa" w:w="5626"/>
+            <w:tcMar>
+              <w:top w:type="dxa" w:w="70"/>
+              <w:left w:type="dxa" w:w="110"/>
+              <w:bottom w:type="dxa" w:w="70"/>
+              <w:right w:type="dxa" w:w="110"/>
+            </w:tcMar>
+          </w:tcPr>
+          <w:p>
+            <w:pPr>
+              <w:spacing w:after="0" w:line="240"/>
+            </w:pPr>
+            <w:r>
+              <w:rPr>
+                <w:sz w:val="19"/>
+                <w:szCs w:val="19"/>
+              </w:rPr>
+              <w:t xml:space="preserve">385 436 (308 888 z TERYT, reszta z PRG)</w:t>
+            </w:r>
+          </w:p>
+        </w:tc>
+      </w:tr>
+      <w:tr>
+        <w:tc>
+          <w:tcPr>
+            <w:tcW w:type="dxa" w:w="3400"/>
+            <w:tcMar>
+              <w:top w:type="dxa" w:w="70"/>
+              <w:left w:type="dxa" w:w="110"/>
+              <w:bottom w:type="dxa" w:w="70"/>
+              <w:right w:type="dxa" w:w="110"/>
+            </w:tcMar>
+          </w:tcPr>
+          <w:p>
+            <w:pPr>
+              <w:spacing w:after="0" w:line="240"/>
+            </w:pPr>
+            <w:r>
+              <w:rPr>
+                <w:sz w:val="19"/>
+                <w:szCs w:val="19"/>
+              </w:rPr>
+              <w:t xml:space="preserve">Artefakt wyszukiwania</w:t>
+            </w:r>
+          </w:p>
+        </w:tc>
+        <w:tc>
+          <w:tcPr>
+            <w:tcW w:type="dxa" w:w="5626"/>
+            <w:tcMar>
+              <w:top w:type="dxa" w:w="70"/>
+              <w:left w:type="dxa" w:w="110"/>
+              <w:bottom w:type="dxa" w:w="70"/>
+              <w:right w:type="dxa" w:w="110"/>
+            </w:tcMar>
+          </w:tcPr>
+          <w:p>
+            <w:pPr>
+              <w:spacing w:after="0" w:line="240"/>
+            </w:pPr>
+            <w:r>
+              <w:rPr>
+                <w:sz w:val="19"/>
+                <w:szCs w:val="19"/>
+              </w:rPr>
+              <w:t xml:space="preserve">487 301 pozycji, 66,4 MB</w:t>
+            </w:r>
+          </w:p>
+        </w:tc>
+      </w:tr>
+      <w:tr>
+        <w:tc>
+          <w:tcPr>
+            <w:tcW w:type="dxa" w:w="3400"/>
+            <w:tcMar>
+              <w:top w:type="dxa" w:w="70"/>
+              <w:left w:type="dxa" w:w="110"/>
+              <w:bottom w:type="dxa" w:w="70"/>
+              <w:right w:type="dxa" w:w="110"/>
+            </w:tcMar>
+          </w:tcPr>
+          <w:p>
+            <w:pPr>
+              <w:spacing w:after="0" w:line="240"/>
+            </w:pPr>
+            <w:r>
+              <w:rPr>
+                <w:sz w:val="19"/>
+                <w:szCs w:val="19"/>
+              </w:rPr>
+              <w:t xml:space="preserve">Zakres</w:t>
+            </w:r>
+          </w:p>
+        </w:tc>
+        <w:tc>
+          <w:tcPr>
+            <w:tcW w:type="dxa" w:w="5626"/>
+            <w:tcMar>
+              <w:top w:type="dxa" w:w="70"/>
+              <w:left w:type="dxa" w:w="110"/>
+              <w:bottom w:type="dxa" w:w="70"/>
+              <w:right w:type="dxa" w:w="110"/>
+            </w:tcMar>
+          </w:tcPr>
+          <w:p>
+            <w:pPr>
+              <w:spacing w:after="0" w:line="240"/>
+            </w:pPr>
+            <w:r>
+              <w:rPr>
+                <w:sz w:val="19"/>
+                <w:szCs w:val="19"/>
+              </w:rPr>
+              <w:t xml:space="preserve">4 województwa z 16 — pozostałe pobrane, czekają na przetworzenie</w:t>
+            </w:r>
+          </w:p>
+        </w:tc>
+      </w:tr>
+    </w:tbl>
+    <w:p>
+      <w:pPr>
+        <w:spacing w:after="160"/>
+      </w:pPr>
     </w:p>
     <w:p>
       <w:pPr>
@@ -10231,7 +10955,7 @@
           <w:sz w:val="21"/>
           <w:szCs w:val="21"/>
         </w:rPr>
-        <w:t xml:space="preserve">Zabezpieczenie zrzutu. Pobrano komplet 16 województw, 1,8 GB, oznaczony wersją 2026-08-06, z sumą kontrolną każdego pliku. Realizuje to decyzję o archiwizacji przed 1 września 2026. Istotne: sierpniowa paczka zawiera równolegle plik w strukturze dotychczasowej i w nowej, więc zabezpieczone zostały obie — łącznie z atrybutami, które po tej dacie znikną.</w:t>
+        <w:t xml:space="preserve">Zabezpieczenie zrzutu. Pobrano komplet 16 województw (1,8 GB) z sumą kontrolną każdego pliku. Realizuje to decyzję o archiwizacji przed 1 września 2026.</w:t>
       </w:r>
     </w:p>
     <w:p>
@@ -10243,7 +10967,7 @@
           <w:sz w:val="21"/>
           <w:szCs w:val="21"/>
         </w:rPr>
-        <w:t xml:space="preserve">Słowniki TERYT — bez konta w GUS. Usługa sieciowa GUS nie odpowiadała na żadne zapytanie SOAP (przerwanie po 30 i po 60 sekundach, przy poprawnie działającym pobraniu opisu usługi w 2,2 s). Okazało się to jednak nieistotne: te same katalogi są udostępniane jako pliki do pobrania bez rejestracji i bez konta. Załadowano 4360 jednostek podziału terytorialnego, 101 865 miejscowości i 308 888 ulic. Pozycja „Import słowników TERYT” z planu prac jest zamknięta, a zależność od rejestracji w GUS — nieaktualna.</w:t>
+        <w:t xml:space="preserve">Sierpniowa paczka zawiera równolegle plik w strukturze dotychczasowej i nowej, więc zabezpieczono obie — łącznie z atrybutami, które po tej dacie znikną.</w:t>
       </w:r>
     </w:p>
     <w:p>
@@ -10255,7 +10979,49 @@
           <w:sz w:val="21"/>
           <w:szCs w:val="21"/>
         </w:rPr>
-        <w:t xml:space="preserve">Nowa struktura danych działa. Parser rozpoznał rzeczywisty plik w strukturze obowiązującej od 1 września 2026 (przestrzeń nazw https://geoportal.gov.pl/schemas/prgad/1.0) i nie odrzucił ani jednego rekordu. To najważniejszy wynik dla oceny ryzyka związanego z wrześniową zmianą formatu: przejście nie wymaga przebudowy, potwierdza się to na danych, a nie tylko na deklaracji.</w:t>
+        <w:t xml:space="preserve">Słowniki TERYT pobrano bez konta w GUS. Usługa sieciowa nie odpowiadała na żadne zapytanie, ale te same katalogi są udostępniane jako pliki bez rejestracji. Pozycja „Import słowników TERYT” z planu prac jest zamknięta, a zależność od rejestracji w GUS — nieaktualna.</w:t>
+      </w:r>
+    </w:p>
+    <w:p>
+      <w:pPr>
+        <w:pBdr>
+          <w:top w:val="single" w:color="D5DBE0" w:sz="4"/>
+          <w:bottom w:val="single" w:color="D5DBE0" w:sz="0"/>
+          <w:left w:val="single" w:color="D5DBE0" w:sz="4"/>
+          <w:right w:val="single" w:color="D5DBE0" w:sz="4"/>
+        </w:pBdr>
+        <w:shd w:fill="FDF1E7" w:color="auto" w:val="clear"/>
+        <w:spacing w:after="0" w:before="160" w:line="276"/>
+        <w:ind w:left="120" w:right="120"/>
+      </w:pPr>
+      <w:r>
+        <w:rPr>
+          <w:b/>
+          <w:bCs/>
+          <w:sz w:val="21"/>
+          <w:szCs w:val="21"/>
+        </w:rPr>
+        <w:t xml:space="preserve">Najważniejszy wynik dla oceny ryzyka</w:t>
+      </w:r>
+    </w:p>
+    <w:p>
+      <w:pPr>
+        <w:pBdr>
+          <w:top w:val="single" w:color="D5DBE0" w:sz="0"/>
+          <w:bottom w:val="single" w:color="D5DBE0" w:sz="4"/>
+          <w:left w:val="single" w:color="D5DBE0" w:sz="4"/>
+          <w:right w:val="single" w:color="D5DBE0" w:sz="4"/>
+        </w:pBdr>
+        <w:shd w:fill="FDF1E7" w:color="auto" w:val="clear"/>
+        <w:spacing w:after="160" w:line="276"/>
+        <w:ind w:left="120" w:right="120"/>
+      </w:pPr>
+      <w:r>
+        <w:rPr>
+          <w:sz w:val="20"/>
+          <w:szCs w:val="20"/>
+        </w:rPr>
+        <w:t xml:space="preserve">Parser przeszedł przez rzeczywisty plik w strukturze obowiązującej od 1 września 2026 i nie odrzucił ani jednego rekordu. Wrześniowa zmiana formatu — dotąd największe ryzyko w tym opracowaniu — jest potwierdzona jako opanowana na danych, a nie tylko deklarowana.</w:t>
       </w:r>
     </w:p>
     <w:p>
@@ -10267,7 +11033,16 @@
           <w:sz w:val="21"/>
           <w:szCs w:val="21"/>
         </w:rPr>
-        <w:t xml:space="preserve">Załadowane dane. Mazowieckie: 1 266 579 punktów adresowych. Po dołożeniu trzech kolejnych województw w bazie znalazło się 1 990 498 punktów, a zbudowany artefakt wyszukiwania objął 410 753 pozycje i zajął 55,3 MB — zgodnie z wcześniejszym szacunkiem 53 MB.</w:t>
+        <w:t xml:space="preserve">Kontrole jakości zadziałały zgodnie z projektem: przy próbie publikacji jednego województwa wstrzymały podmianę, bo 1,27 mln punktów to znacznie poniżej progu ustawionego dla całego kraju. To zachowanie prawidłowe.</w:t>
+      </w:r>
+    </w:p>
+    <w:p>
+      <w:pPr>
+        <w:pStyle w:val="Heading2"/>
+        <w:spacing w:after="140" w:before="280"/>
+      </w:pPr>
+      <w:r>
+        <w:t xml:space="preserve">8.4. Usterki wykryte na pełnym zbiorze</w:t>
       </w:r>
     </w:p>
     <w:p>
@@ -10279,7 +11054,370 @@
           <w:sz w:val="21"/>
           <w:szCs w:val="21"/>
         </w:rPr>
-        <w:t xml:space="preserve">Kontrole jakości zadziałały zgodnie z projektem. Przy próbie publikacji jednego województwa kontrola minimalnej liczby rekordów wstrzymała podmianę, bo 1,27 mln punktów to znacznie poniżej progu 7,5 mln ustawionego dla całego kraju. Jest to zachowanie prawidłowe — dokładnie ten mechanizm chroni przed opublikowaniem niekompletnego zrzutu.</w:t>
+        <w:t xml:space="preserve">Pięć usterek ujawniło się dopiero na danych rzeczywistych. Wszystkie naprawiono.</w:t>
+      </w:r>
+    </w:p>
+    <w:tbl>
+      <w:tblPr>
+        <w:tblW w:type="dxa" w:w="9026"/>
+        <w:tblBorders>
+          <w:top w:val="single" w:color="auto" w:sz="4"/>
+          <w:left w:val="single" w:color="auto" w:sz="4"/>
+          <w:bottom w:val="single" w:color="auto" w:sz="4"/>
+          <w:right w:val="single" w:color="auto" w:sz="4"/>
+          <w:insideH w:val="single" w:color="auto" w:sz="4"/>
+          <w:insideV w:val="single" w:color="auto" w:sz="4"/>
+        </w:tblBorders>
+      </w:tblPr>
+      <w:tblGrid>
+        <w:gridCol w:w="4200"/>
+        <w:gridCol w:w="4826"/>
+      </w:tblGrid>
+      <w:tr>
+        <w:trPr>
+          <w:tblHeader/>
+        </w:trPr>
+        <w:tc>
+          <w:tcPr>
+            <w:tcW w:type="dxa" w:w="4200"/>
+            <w:shd w:fill="E8EDF2" w:color="auto" w:val="clear"/>
+            <w:tcMar>
+              <w:top w:type="dxa" w:w="70"/>
+              <w:left w:type="dxa" w:w="110"/>
+              <w:bottom w:type="dxa" w:w="70"/>
+              <w:right w:type="dxa" w:w="110"/>
+            </w:tcMar>
+            <w:vAlign w:val="center"/>
+          </w:tcPr>
+          <w:p>
+            <w:pPr>
+              <w:spacing w:after="0" w:line="240"/>
+            </w:pPr>
+            <w:r>
+              <w:rPr>
+                <w:b/>
+                <w:bCs/>
+                <w:sz w:val="19"/>
+                <w:szCs w:val="19"/>
+              </w:rPr>
+              <w:t xml:space="preserve">Usterka</w:t>
+            </w:r>
+          </w:p>
+        </w:tc>
+        <w:tc>
+          <w:tcPr>
+            <w:tcW w:type="dxa" w:w="4826"/>
+            <w:shd w:fill="E8EDF2" w:color="auto" w:val="clear"/>
+            <w:tcMar>
+              <w:top w:type="dxa" w:w="70"/>
+              <w:left w:type="dxa" w:w="110"/>
+              <w:bottom w:type="dxa" w:w="70"/>
+              <w:right w:type="dxa" w:w="110"/>
+            </w:tcMar>
+            <w:vAlign w:val="center"/>
+          </w:tcPr>
+          <w:p>
+            <w:pPr>
+              <w:spacing w:after="0" w:line="240"/>
+            </w:pPr>
+            <w:r>
+              <w:rPr>
+                <w:b/>
+                <w:bCs/>
+                <w:sz w:val="19"/>
+                <w:szCs w:val="19"/>
+              </w:rPr>
+              <w:t xml:space="preserve">Skutek przed naprawą</w:t>
+            </w:r>
+          </w:p>
+        </w:tc>
+      </w:tr>
+      <w:tr>
+        <w:tc>
+          <w:tcPr>
+            <w:tcW w:type="dxa" w:w="4200"/>
+            <w:tcMar>
+              <w:top w:type="dxa" w:w="70"/>
+              <w:left w:type="dxa" w:w="110"/>
+              <w:bottom w:type="dxa" w:w="70"/>
+              <w:right w:type="dxa" w:w="110"/>
+            </w:tcMar>
+          </w:tcPr>
+          <w:p>
+            <w:pPr>
+              <w:spacing w:after="0" w:line="240"/>
+            </w:pPr>
+            <w:r>
+              <w:rPr>
+                <w:sz w:val="19"/>
+                <w:szCs w:val="19"/>
+              </w:rPr>
+              <w:t xml:space="preserve">Dekodowanie porcji strumienia osobno rozcinało polskie znaki</w:t>
+            </w:r>
+          </w:p>
+        </w:tc>
+        <w:tc>
+          <w:tcPr>
+            <w:tcW w:type="dxa" w:w="4826"/>
+            <w:tcMar>
+              <w:top w:type="dxa" w:w="70"/>
+              <w:left w:type="dxa" w:w="110"/>
+              <w:bottom w:type="dxa" w:w="70"/>
+              <w:right w:type="dxa" w:w="110"/>
+            </w:tcMar>
+          </w:tcPr>
+          <w:p>
+            <w:pPr>
+              <w:spacing w:after="0" w:line="240"/>
+            </w:pPr>
+            <w:r>
+              <w:rPr>
+                <w:sz w:val="19"/>
+                <w:szCs w:val="19"/>
+              </w:rPr>
+              <w:t xml:space="preserve">Uszkodzone nazwy ulic — jedna na województwo, bez ostrzeżenia</w:t>
+            </w:r>
+          </w:p>
+        </w:tc>
+      </w:tr>
+      <w:tr>
+        <w:tc>
+          <w:tcPr>
+            <w:tcW w:type="dxa" w:w="4200"/>
+            <w:tcMar>
+              <w:top w:type="dxa" w:w="70"/>
+              <w:left w:type="dxa" w:w="110"/>
+              <w:bottom w:type="dxa" w:w="70"/>
+              <w:right w:type="dxa" w:w="110"/>
+            </w:tcMar>
+          </w:tcPr>
+          <w:p>
+            <w:pPr>
+              <w:spacing w:after="0" w:line="240"/>
+            </w:pPr>
+            <w:r>
+              <w:rPr>
+                <w:sz w:val="19"/>
+                <w:szCs w:val="19"/>
+              </w:rPr>
+              <w:t xml:space="preserve">Błędne wiązanie punktów z miejscowościami w nowej strukturze</w:t>
+            </w:r>
+          </w:p>
+        </w:tc>
+        <w:tc>
+          <w:tcPr>
+            <w:tcW w:type="dxa" w:w="4826"/>
+            <w:tcMar>
+              <w:top w:type="dxa" w:w="70"/>
+              <w:left w:type="dxa" w:w="110"/>
+              <w:bottom w:type="dxa" w:w="70"/>
+              <w:right w:type="dxa" w:w="110"/>
+            </w:tcMar>
+          </w:tcPr>
+          <w:p>
+            <w:pPr>
+              <w:spacing w:after="0" w:line="240"/>
+            </w:pPr>
+            <w:r>
+              <w:rPr>
+                <w:sz w:val="19"/>
+                <w:szCs w:val="19"/>
+              </w:rPr>
+              <w:t xml:space="preserve">Publikacja przerywana; przy szerszej kolumnie — ciche śmieci zamiast identyfikatorów</w:t>
+            </w:r>
+          </w:p>
+        </w:tc>
+      </w:tr>
+      <w:tr>
+        <w:tc>
+          <w:tcPr>
+            <w:tcW w:type="dxa" w:w="4200"/>
+            <w:tcMar>
+              <w:top w:type="dxa" w:w="70"/>
+              <w:left w:type="dxa" w:w="110"/>
+              <w:bottom w:type="dxa" w:w="70"/>
+              <w:right w:type="dxa" w:w="110"/>
+            </w:tcMar>
+          </w:tcPr>
+          <w:p>
+            <w:pPr>
+              <w:spacing w:after="0" w:line="240"/>
+            </w:pPr>
+            <w:r>
+              <w:rPr>
+                <w:sz w:val="19"/>
+                <w:szCs w:val="19"/>
+              </w:rPr>
+              <w:t xml:space="preserve">Zdublowane pozycje w słownikach źródłowych</w:t>
+            </w:r>
+          </w:p>
+        </w:tc>
+        <w:tc>
+          <w:tcPr>
+            <w:tcW w:type="dxa" w:w="4826"/>
+            <w:tcMar>
+              <w:top w:type="dxa" w:w="70"/>
+              <w:left w:type="dxa" w:w="110"/>
+              <w:bottom w:type="dxa" w:w="70"/>
+              <w:right w:type="dxa" w:w="110"/>
+            </w:tcMar>
+          </w:tcPr>
+          <w:p>
+            <w:pPr>
+              <w:spacing w:after="0" w:line="240"/>
+            </w:pPr>
+            <w:r>
+              <w:rPr>
+                <w:sz w:val="19"/>
+                <w:szCs w:val="19"/>
+              </w:rPr>
+              <w:t xml:space="preserve">Jeden zdublowany rekord wstrzymywał publikację całego kraju</w:t>
+            </w:r>
+          </w:p>
+        </w:tc>
+      </w:tr>
+      <w:tr>
+        <w:tc>
+          <w:tcPr>
+            <w:tcW w:type="dxa" w:w="4200"/>
+            <w:tcMar>
+              <w:top w:type="dxa" w:w="70"/>
+              <w:left w:type="dxa" w:w="110"/>
+              <w:bottom w:type="dxa" w:w="70"/>
+              <w:right w:type="dxa" w:w="110"/>
+            </w:tcMar>
+          </w:tcPr>
+          <w:p>
+            <w:pPr>
+              <w:spacing w:after="0" w:line="240"/>
+            </w:pPr>
+            <w:r>
+              <w:rPr>
+                <w:sz w:val="19"/>
+                <w:szCs w:val="19"/>
+              </w:rPr>
+              <w:t xml:space="preserve">Zapytanie wiążące punkty z ulicami bez możliwości użycia indeksu</w:t>
+            </w:r>
+          </w:p>
+        </w:tc>
+        <w:tc>
+          <w:tcPr>
+            <w:tcW w:type="dxa" w:w="4826"/>
+            <w:tcMar>
+              <w:top w:type="dxa" w:w="70"/>
+              <w:left w:type="dxa" w:w="110"/>
+              <w:bottom w:type="dxa" w:w="70"/>
+              <w:right w:type="dxa" w:w="110"/>
+            </w:tcMar>
+          </w:tcPr>
+          <w:p>
+            <w:pPr>
+              <w:spacing w:after="0" w:line="240"/>
+            </w:pPr>
+            <w:r>
+              <w:rPr>
+                <w:sz w:val="19"/>
+                <w:szCs w:val="19"/>
+              </w:rPr>
+              <w:t xml:space="preserve">Ponad 100 mld porównań — przebieg przerwany po 8 godzinach bez wyniku</w:t>
+            </w:r>
+          </w:p>
+        </w:tc>
+      </w:tr>
+      <w:tr>
+        <w:tc>
+          <w:tcPr>
+            <w:tcW w:type="dxa" w:w="4200"/>
+            <w:tcMar>
+              <w:top w:type="dxa" w:w="70"/>
+              <w:left w:type="dxa" w:w="110"/>
+              <w:bottom w:type="dxa" w:w="70"/>
+              <w:right w:type="dxa" w:w="110"/>
+            </w:tcMar>
+          </w:tcPr>
+          <w:p>
+            <w:pPr>
+              <w:spacing w:after="0" w:line="240"/>
+            </w:pPr>
+            <w:r>
+              <w:rPr>
+                <w:sz w:val="19"/>
+                <w:szCs w:val="19"/>
+              </w:rPr>
+              <w:t xml:space="preserve">Słowniki TERYT wstawiane rekord po rekordzie</w:t>
+            </w:r>
+          </w:p>
+        </w:tc>
+        <w:tc>
+          <w:tcPr>
+            <w:tcW w:type="dxa" w:w="4826"/>
+            <w:tcMar>
+              <w:top w:type="dxa" w:w="70"/>
+              <w:left w:type="dxa" w:w="110"/>
+              <w:bottom w:type="dxa" w:w="70"/>
+              <w:right w:type="dxa" w:w="110"/>
+            </w:tcMar>
+          </w:tcPr>
+          <w:p>
+            <w:pPr>
+              <w:spacing w:after="0" w:line="240"/>
+            </w:pPr>
+            <w:r>
+              <w:rPr>
+                <w:sz w:val="19"/>
+                <w:szCs w:val="19"/>
+              </w:rPr>
+              <w:t xml:space="preserve">Ponad 20 minut i zerwane połączenie; po zmianie — 8 minut</w:t>
+            </w:r>
+          </w:p>
+        </w:tc>
+      </w:tr>
+    </w:tbl>
+    <w:p>
+      <w:pPr>
+        <w:spacing w:after="160"/>
+      </w:pPr>
+    </w:p>
+    <w:p>
+      <w:pPr>
+        <w:pBdr>
+          <w:top w:val="single" w:color="D5DBE0" w:sz="4"/>
+          <w:bottom w:val="single" w:color="D5DBE0" w:sz="0"/>
+          <w:left w:val="single" w:color="D5DBE0" w:sz="4"/>
+          <w:right w:val="single" w:color="D5DBE0" w:sz="4"/>
+        </w:pBdr>
+        <w:shd w:fill="FDF1E7" w:color="auto" w:val="clear"/>
+        <w:spacing w:after="0" w:before="160" w:line="276"/>
+        <w:ind w:left="120" w:right="120"/>
+      </w:pPr>
+      <w:r>
+        <w:rPr>
+          <w:b/>
+          <w:bCs/>
+          <w:sz w:val="21"/>
+          <w:szCs w:val="21"/>
+        </w:rPr>
+        <w:t xml:space="preserve">Wniosek metodyczny</w:t>
+      </w:r>
+    </w:p>
+    <w:p>
+      <w:pPr>
+        <w:pBdr>
+          <w:top w:val="single" w:color="D5DBE0" w:sz="0"/>
+          <w:bottom w:val="single" w:color="D5DBE0" w:sz="4"/>
+          <w:left w:val="single" w:color="D5DBE0" w:sz="4"/>
+          <w:right w:val="single" w:color="D5DBE0" w:sz="4"/>
+        </w:pBdr>
+        <w:shd w:fill="FDF1E7" w:color="auto" w:val="clear"/>
+        <w:spacing w:after="160" w:line="276"/>
+        <w:ind w:left="120" w:right="120"/>
+      </w:pPr>
+      <w:r>
+        <w:rPr>
+          <w:sz w:val="20"/>
+          <w:szCs w:val="20"/>
+        </w:rPr>
+        <w:t xml:space="preserve">Żadnej z tych pięciu usterek nie dało się wykryć na danych testowych. Cztery z nich ujawniają się wyłącznie przy skali, a jedna dopiero po naprawieniu poprzedniej. Harmonogram wdrożenia musi przewidywać przebieg na pełnym zbiorze przed produkcją — testy na próbkach nie wykrywają ani błędów skali, ani błędów wiązania danych.</w:t>
       </w:r>
     </w:p>
     <w:p>
@@ -10288,7 +11426,7 @@
         <w:spacing w:after="140" w:before="280"/>
       </w:pPr>
       <w:r>
-        <w:t xml:space="preserve">8.4. Usterki wykryte na pełnym zbiorze</w:t>
+        <w:t xml:space="preserve">8.5. Wydajność przetwarzania</w:t>
       </w:r>
     </w:p>
     <w:p>
@@ -10300,8 +11438,377 @@
           <w:sz w:val="21"/>
           <w:szCs w:val="21"/>
         </w:rPr>
-        <w:t xml:space="preserve">Trzy problemy ujawniły się dopiero na danych rzeczywistych. Wszystkie zostały naprawione, ale warto je odnotować, bo pokazują, czego nie wykrywają testy na próbkach.</w:t>
-      </w:r>
+        <w:t xml:space="preserve">Pomiary na komputerze przenośnym: 8 rdzeni, przetwarzanie w kontenerach, archiwum na dysku hosta. Na serwerze wyniki będą lepsze, proporcje pozostaną.</w:t>
+      </w:r>
+    </w:p>
+    <w:tbl>
+      <w:tblPr>
+        <w:tblW w:type="dxa" w:w="9026"/>
+        <w:tblBorders>
+          <w:top w:val="single" w:color="auto" w:sz="4"/>
+          <w:left w:val="single" w:color="auto" w:sz="4"/>
+          <w:bottom w:val="single" w:color="auto" w:sz="4"/>
+          <w:right w:val="single" w:color="auto" w:sz="4"/>
+          <w:insideH w:val="single" w:color="auto" w:sz="4"/>
+          <w:insideV w:val="single" w:color="auto" w:sz="4"/>
+        </w:tblBorders>
+      </w:tblPr>
+      <w:tblGrid>
+        <w:gridCol w:w="4600"/>
+        <w:gridCol w:w="4426"/>
+      </w:tblGrid>
+      <w:tr>
+        <w:trPr>
+          <w:tblHeader/>
+        </w:trPr>
+        <w:tc>
+          <w:tcPr>
+            <w:tcW w:type="dxa" w:w="4600"/>
+            <w:shd w:fill="E8EDF2" w:color="auto" w:val="clear"/>
+            <w:tcMar>
+              <w:top w:type="dxa" w:w="70"/>
+              <w:left w:type="dxa" w:w="110"/>
+              <w:bottom w:type="dxa" w:w="70"/>
+              <w:right w:type="dxa" w:w="110"/>
+            </w:tcMar>
+            <w:vAlign w:val="center"/>
+          </w:tcPr>
+          <w:p>
+            <w:pPr>
+              <w:spacing w:after="0" w:line="240"/>
+            </w:pPr>
+            <w:r>
+              <w:rPr>
+                <w:b/>
+                <w:bCs/>
+                <w:sz w:val="19"/>
+                <w:szCs w:val="19"/>
+              </w:rPr>
+              <w:t xml:space="preserve">Etap</w:t>
+            </w:r>
+          </w:p>
+        </w:tc>
+        <w:tc>
+          <w:tcPr>
+            <w:tcW w:type="dxa" w:w="4426"/>
+            <w:shd w:fill="E8EDF2" w:color="auto" w:val="clear"/>
+            <w:tcMar>
+              <w:top w:type="dxa" w:w="70"/>
+              <w:left w:type="dxa" w:w="110"/>
+              <w:bottom w:type="dxa" w:w="70"/>
+              <w:right w:type="dxa" w:w="110"/>
+            </w:tcMar>
+            <w:vAlign w:val="center"/>
+          </w:tcPr>
+          <w:p>
+            <w:pPr>
+              <w:spacing w:after="0" w:line="240"/>
+            </w:pPr>
+            <w:r>
+              <w:rPr>
+                <w:b/>
+                <w:bCs/>
+                <w:sz w:val="19"/>
+                <w:szCs w:val="19"/>
+              </w:rPr>
+              <w:t xml:space="preserve">Czas</w:t>
+            </w:r>
+          </w:p>
+        </w:tc>
+      </w:tr>
+      <w:tr>
+        <w:tc>
+          <w:tcPr>
+            <w:tcW w:type="dxa" w:w="4600"/>
+            <w:tcMar>
+              <w:top w:type="dxa" w:w="70"/>
+              <w:left w:type="dxa" w:w="110"/>
+              <w:bottom w:type="dxa" w:w="70"/>
+              <w:right w:type="dxa" w:w="110"/>
+            </w:tcMar>
+          </w:tcPr>
+          <w:p>
+            <w:pPr>
+              <w:spacing w:after="0" w:line="240"/>
+            </w:pPr>
+            <w:r>
+              <w:rPr>
+                <w:sz w:val="19"/>
+                <w:szCs w:val="19"/>
+              </w:rPr>
+              <w:t xml:space="preserve">Parsowanie punktów adresowych</w:t>
+            </w:r>
+          </w:p>
+        </w:tc>
+        <w:tc>
+          <w:tcPr>
+            <w:tcW w:type="dxa" w:w="4426"/>
+            <w:tcMar>
+              <w:top w:type="dxa" w:w="70"/>
+              <w:left w:type="dxa" w:w="110"/>
+              <w:bottom w:type="dxa" w:w="70"/>
+              <w:right w:type="dxa" w:w="110"/>
+            </w:tcMar>
+          </w:tcPr>
+          <w:p>
+            <w:pPr>
+              <w:spacing w:after="0" w:line="240"/>
+            </w:pPr>
+            <w:r>
+              <w:rPr>
+                <w:sz w:val="19"/>
+                <w:szCs w:val="19"/>
+              </w:rPr>
+              <w:t xml:space="preserve">902 rekordy/s</w:t>
+            </w:r>
+          </w:p>
+        </w:tc>
+      </w:tr>
+      <w:tr>
+        <w:tc>
+          <w:tcPr>
+            <w:tcW w:type="dxa" w:w="4600"/>
+            <w:tcMar>
+              <w:top w:type="dxa" w:w="70"/>
+              <w:left w:type="dxa" w:w="110"/>
+              <w:bottom w:type="dxa" w:w="70"/>
+              <w:right w:type="dxa" w:w="110"/>
+            </w:tcMar>
+          </w:tcPr>
+          <w:p>
+            <w:pPr>
+              <w:spacing w:after="0" w:line="240"/>
+            </w:pPr>
+            <w:r>
+              <w:rPr>
+                <w:sz w:val="19"/>
+                <w:szCs w:val="19"/>
+              </w:rPr>
+              <w:t xml:space="preserve">Parsowanie miejscowości i ulic</w:t>
+            </w:r>
+          </w:p>
+        </w:tc>
+        <w:tc>
+          <w:tcPr>
+            <w:tcW w:type="dxa" w:w="4426"/>
+            <w:tcMar>
+              <w:top w:type="dxa" w:w="70"/>
+              <w:left w:type="dxa" w:w="110"/>
+              <w:bottom w:type="dxa" w:w="70"/>
+              <w:right w:type="dxa" w:w="110"/>
+            </w:tcMar>
+          </w:tcPr>
+          <w:p>
+            <w:pPr>
+              <w:spacing w:after="0" w:line="240"/>
+            </w:pPr>
+            <w:r>
+              <w:rPr>
+                <w:sz w:val="19"/>
+                <w:szCs w:val="19"/>
+              </w:rPr>
+              <w:t xml:space="preserve">~460 rekordów/s — więcej pól na rekord</w:t>
+            </w:r>
+          </w:p>
+        </w:tc>
+      </w:tr>
+      <w:tr>
+        <w:tc>
+          <w:tcPr>
+            <w:tcW w:type="dxa" w:w="4600"/>
+            <w:tcMar>
+              <w:top w:type="dxa" w:w="70"/>
+              <w:left w:type="dxa" w:w="110"/>
+              <w:bottom w:type="dxa" w:w="70"/>
+              <w:right w:type="dxa" w:w="110"/>
+            </w:tcMar>
+          </w:tcPr>
+          <w:p>
+            <w:pPr>
+              <w:spacing w:after="0" w:line="240"/>
+            </w:pPr>
+            <w:r>
+              <w:rPr>
+                <w:sz w:val="19"/>
+                <w:szCs w:val="19"/>
+              </w:rPr>
+              <w:t xml:space="preserve">Wczytanie województwa (1,27 mln punktów)</w:t>
+            </w:r>
+          </w:p>
+        </w:tc>
+        <w:tc>
+          <w:tcPr>
+            <w:tcW w:type="dxa" w:w="4426"/>
+            <w:tcMar>
+              <w:top w:type="dxa" w:w="70"/>
+              <w:left w:type="dxa" w:w="110"/>
+              <w:bottom w:type="dxa" w:w="70"/>
+              <w:right w:type="dxa" w:w="110"/>
+            </w:tcMar>
+          </w:tcPr>
+          <w:p>
+            <w:pPr>
+              <w:spacing w:after="0" w:line="240"/>
+            </w:pPr>
+            <w:r>
+              <w:rPr>
+                <w:sz w:val="19"/>
+                <w:szCs w:val="19"/>
+              </w:rPr>
+              <w:t xml:space="preserve">~38 minut</w:t>
+            </w:r>
+          </w:p>
+        </w:tc>
+      </w:tr>
+      <w:tr>
+        <w:tc>
+          <w:tcPr>
+            <w:tcW w:type="dxa" w:w="4600"/>
+            <w:tcMar>
+              <w:top w:type="dxa" w:w="70"/>
+              <w:left w:type="dxa" w:w="110"/>
+              <w:bottom w:type="dxa" w:w="70"/>
+              <w:right w:type="dxa" w:w="110"/>
+            </w:tcMar>
+          </w:tcPr>
+          <w:p>
+            <w:pPr>
+              <w:spacing w:after="0" w:line="240"/>
+            </w:pPr>
+            <w:r>
+              <w:rPr>
+                <w:sz w:val="19"/>
+                <w:szCs w:val="19"/>
+              </w:rPr>
+              <w:t xml:space="preserve">Import słowników TERYT (400 tys. rekordów)</w:t>
+            </w:r>
+          </w:p>
+        </w:tc>
+        <w:tc>
+          <w:tcPr>
+            <w:tcW w:type="dxa" w:w="4426"/>
+            <w:tcMar>
+              <w:top w:type="dxa" w:w="70"/>
+              <w:left w:type="dxa" w:w="110"/>
+              <w:bottom w:type="dxa" w:w="70"/>
+              <w:right w:type="dxa" w:w="110"/>
+            </w:tcMar>
+          </w:tcPr>
+          <w:p>
+            <w:pPr>
+              <w:spacing w:after="0" w:line="240"/>
+            </w:pPr>
+            <w:r>
+              <w:rPr>
+                <w:sz w:val="19"/>
+                <w:szCs w:val="19"/>
+              </w:rPr>
+              <w:t xml:space="preserve">8 minut</w:t>
+            </w:r>
+          </w:p>
+        </w:tc>
+      </w:tr>
+      <w:tr>
+        <w:tc>
+          <w:tcPr>
+            <w:tcW w:type="dxa" w:w="4600"/>
+            <w:tcMar>
+              <w:top w:type="dxa" w:w="70"/>
+              <w:left w:type="dxa" w:w="110"/>
+              <w:bottom w:type="dxa" w:w="70"/>
+              <w:right w:type="dxa" w:w="110"/>
+            </w:tcMar>
+          </w:tcPr>
+          <w:p>
+            <w:pPr>
+              <w:spacing w:after="0" w:line="240"/>
+            </w:pPr>
+            <w:r>
+              <w:rPr>
+                <w:sz w:val="19"/>
+                <w:szCs w:val="19"/>
+              </w:rPr>
+              <w:t xml:space="preserve">Publikacja 4 województw</w:t>
+            </w:r>
+          </w:p>
+        </w:tc>
+        <w:tc>
+          <w:tcPr>
+            <w:tcW w:type="dxa" w:w="4426"/>
+            <w:tcMar>
+              <w:top w:type="dxa" w:w="70"/>
+              <w:left w:type="dxa" w:w="110"/>
+              <w:bottom w:type="dxa" w:w="70"/>
+              <w:right w:type="dxa" w:w="110"/>
+            </w:tcMar>
+          </w:tcPr>
+          <w:p>
+            <w:pPr>
+              <w:spacing w:after="0" w:line="240"/>
+            </w:pPr>
+            <w:r>
+              <w:rPr>
+                <w:sz w:val="19"/>
+                <w:szCs w:val="19"/>
+              </w:rPr>
+              <w:t xml:space="preserve">72 minuty</w:t>
+            </w:r>
+          </w:p>
+        </w:tc>
+      </w:tr>
+      <w:tr>
+        <w:tc>
+          <w:tcPr>
+            <w:tcW w:type="dxa" w:w="4600"/>
+            <w:tcMar>
+              <w:top w:type="dxa" w:w="70"/>
+              <w:left w:type="dxa" w:w="110"/>
+              <w:bottom w:type="dxa" w:w="70"/>
+              <w:right w:type="dxa" w:w="110"/>
+            </w:tcMar>
+          </w:tcPr>
+          <w:p>
+            <w:pPr>
+              <w:spacing w:after="0" w:line="240"/>
+            </w:pPr>
+            <w:r>
+              <w:rPr>
+                <w:sz w:val="19"/>
+                <w:szCs w:val="19"/>
+              </w:rPr>
+              <w:t xml:space="preserve">Budowa artefaktu wyszukiwania</w:t>
+            </w:r>
+          </w:p>
+        </w:tc>
+        <w:tc>
+          <w:tcPr>
+            <w:tcW w:type="dxa" w:w="4426"/>
+            <w:tcMar>
+              <w:top w:type="dxa" w:w="70"/>
+              <w:left w:type="dxa" w:w="110"/>
+              <w:bottom w:type="dxa" w:w="70"/>
+              <w:right w:type="dxa" w:w="110"/>
+            </w:tcMar>
+          </w:tcPr>
+          <w:p>
+            <w:pPr>
+              <w:spacing w:after="0" w:line="240"/>
+            </w:pPr>
+            <w:r>
+              <w:rPr>
+                <w:sz w:val="19"/>
+                <w:szCs w:val="19"/>
+              </w:rPr>
+              <w:t xml:space="preserve">3,5 minuty</w:t>
+            </w:r>
+          </w:p>
+        </w:tc>
+      </w:tr>
+    </w:tbl>
+    <w:p>
+      <w:pPr>
+        <w:spacing w:after="160"/>
+      </w:pPr>
     </w:p>
     <w:p>
       <w:pPr>
@@ -10312,8 +11819,259 @@
           <w:sz w:val="21"/>
           <w:szCs w:val="21"/>
         </w:rPr>
-        <w:t xml:space="preserve">Uszkadzanie polskich znaków. Parser dekodował każdą porcję strumienia osobno, więc znak wielobajtowy wypadający na granicy porcji rozpadał się na dwa i zamieniał w znak zastępczy. W jednym województwie dało to jedną uszkodzoną nazwę ulicy — przy całym kraju byłoby ich kilkanaście, bez żadnego ostrzeżenia. Błąd tej klasy nie ujawnia się na małych plikach testowych.</w:t>
-      </w:r>
+        <w:t xml:space="preserve">Pełny przebieg dla kraju wychodził na około 4 godziny — istotnie więcej niż wcześniej zakładane 40 minut. Rozbieżność usunięto: pliki wojewódzkie są niezależne, więc przetwarzanie rozdzielono na równoległe procesy.</w:t>
+      </w:r>
+    </w:p>
+    <w:tbl>
+      <w:tblPr>
+        <w:tblW w:type="dxa" w:w="9026"/>
+        <w:tblBorders>
+          <w:top w:val="single" w:color="auto" w:sz="4"/>
+          <w:left w:val="single" w:color="auto" w:sz="4"/>
+          <w:bottom w:val="single" w:color="auto" w:sz="4"/>
+          <w:right w:val="single" w:color="auto" w:sz="4"/>
+          <w:insideH w:val="single" w:color="auto" w:sz="4"/>
+          <w:insideV w:val="single" w:color="auto" w:sz="4"/>
+        </w:tblBorders>
+      </w:tblPr>
+      <w:tblGrid>
+        <w:gridCol w:w="2600"/>
+        <w:gridCol w:w="3000"/>
+        <w:gridCol w:w="3426"/>
+      </w:tblGrid>
+      <w:tr>
+        <w:trPr>
+          <w:tblHeader/>
+        </w:trPr>
+        <w:tc>
+          <w:tcPr>
+            <w:tcW w:type="dxa" w:w="2600"/>
+            <w:shd w:fill="E8EDF2" w:color="auto" w:val="clear"/>
+            <w:tcMar>
+              <w:top w:type="dxa" w:w="70"/>
+              <w:left w:type="dxa" w:w="110"/>
+              <w:bottom w:type="dxa" w:w="70"/>
+              <w:right w:type="dxa" w:w="110"/>
+            </w:tcMar>
+            <w:vAlign w:val="center"/>
+          </w:tcPr>
+          <w:p>
+            <w:pPr>
+              <w:spacing w:after="0" w:line="240"/>
+            </w:pPr>
+            <w:r>
+              <w:rPr>
+                <w:b/>
+                <w:bCs/>
+                <w:sz w:val="19"/>
+                <w:szCs w:val="19"/>
+              </w:rPr>
+              <w:t xml:space="preserve">Tryb</w:t>
+            </w:r>
+          </w:p>
+        </w:tc>
+        <w:tc>
+          <w:tcPr>
+            <w:tcW w:type="dxa" w:w="3000"/>
+            <w:shd w:fill="E8EDF2" w:color="auto" w:val="clear"/>
+            <w:tcMar>
+              <w:top w:type="dxa" w:w="70"/>
+              <w:left w:type="dxa" w:w="110"/>
+              <w:bottom w:type="dxa" w:w="70"/>
+              <w:right w:type="dxa" w:w="110"/>
+            </w:tcMar>
+            <w:vAlign w:val="center"/>
+          </w:tcPr>
+          <w:p>
+            <w:pPr>
+              <w:spacing w:after="0" w:line="240"/>
+            </w:pPr>
+            <w:r>
+              <w:rPr>
+                <w:b/>
+                <w:bCs/>
+                <w:sz w:val="19"/>
+                <w:szCs w:val="19"/>
+              </w:rPr>
+              <w:t xml:space="preserve">Przepustowość</w:t>
+            </w:r>
+          </w:p>
+        </w:tc>
+        <w:tc>
+          <w:tcPr>
+            <w:tcW w:type="dxa" w:w="3426"/>
+            <w:shd w:fill="E8EDF2" w:color="auto" w:val="clear"/>
+            <w:tcMar>
+              <w:top w:type="dxa" w:w="70"/>
+              <w:left w:type="dxa" w:w="110"/>
+              <w:bottom w:type="dxa" w:w="70"/>
+              <w:right w:type="dxa" w:w="110"/>
+            </w:tcMar>
+            <w:vAlign w:val="center"/>
+          </w:tcPr>
+          <w:p>
+            <w:pPr>
+              <w:spacing w:after="0" w:line="240"/>
+            </w:pPr>
+            <w:r>
+              <w:rPr>
+                <w:b/>
+                <w:bCs/>
+                <w:sz w:val="19"/>
+                <w:szCs w:val="19"/>
+              </w:rPr>
+              <w:t xml:space="preserve">Pełny przebieg dla kraju</w:t>
+            </w:r>
+          </w:p>
+        </w:tc>
+      </w:tr>
+      <w:tr>
+        <w:tc>
+          <w:tcPr>
+            <w:tcW w:type="dxa" w:w="2600"/>
+            <w:tcMar>
+              <w:top w:type="dxa" w:w="70"/>
+              <w:left w:type="dxa" w:w="110"/>
+              <w:bottom w:type="dxa" w:w="70"/>
+              <w:right w:type="dxa" w:w="110"/>
+            </w:tcMar>
+          </w:tcPr>
+          <w:p>
+            <w:pPr>
+              <w:spacing w:after="0" w:line="240"/>
+            </w:pPr>
+            <w:r>
+              <w:rPr>
+                <w:sz w:val="19"/>
+                <w:szCs w:val="19"/>
+              </w:rPr>
+              <w:t xml:space="preserve">Jeden proces</w:t>
+            </w:r>
+          </w:p>
+        </w:tc>
+        <w:tc>
+          <w:tcPr>
+            <w:tcW w:type="dxa" w:w="3000"/>
+            <w:tcMar>
+              <w:top w:type="dxa" w:w="70"/>
+              <w:left w:type="dxa" w:w="110"/>
+              <w:bottom w:type="dxa" w:w="70"/>
+              <w:right w:type="dxa" w:w="110"/>
+            </w:tcMar>
+          </w:tcPr>
+          <w:p>
+            <w:pPr>
+              <w:spacing w:after="0" w:line="240"/>
+            </w:pPr>
+            <w:r>
+              <w:rPr>
+                <w:sz w:val="19"/>
+                <w:szCs w:val="19"/>
+              </w:rPr>
+              <w:t xml:space="preserve">902 rekordy/s</w:t>
+            </w:r>
+          </w:p>
+        </w:tc>
+        <w:tc>
+          <w:tcPr>
+            <w:tcW w:type="dxa" w:w="3426"/>
+            <w:tcMar>
+              <w:top w:type="dxa" w:w="70"/>
+              <w:left w:type="dxa" w:w="110"/>
+              <w:bottom w:type="dxa" w:w="70"/>
+              <w:right w:type="dxa" w:w="110"/>
+            </w:tcMar>
+          </w:tcPr>
+          <w:p>
+            <w:pPr>
+              <w:spacing w:after="0" w:line="240"/>
+            </w:pPr>
+            <w:r>
+              <w:rPr>
+                <w:sz w:val="19"/>
+                <w:szCs w:val="19"/>
+              </w:rPr>
+              <w:t xml:space="preserve">~4 godziny</w:t>
+            </w:r>
+          </w:p>
+        </w:tc>
+      </w:tr>
+      <w:tr>
+        <w:tc>
+          <w:tcPr>
+            <w:tcW w:type="dxa" w:w="2600"/>
+            <w:tcMar>
+              <w:top w:type="dxa" w:w="70"/>
+              <w:left w:type="dxa" w:w="110"/>
+              <w:bottom w:type="dxa" w:w="70"/>
+              <w:right w:type="dxa" w:w="110"/>
+            </w:tcMar>
+          </w:tcPr>
+          <w:p>
+            <w:pPr>
+              <w:spacing w:after="0" w:line="240"/>
+            </w:pPr>
+            <w:r>
+              <w:rPr>
+                <w:sz w:val="19"/>
+                <w:szCs w:val="19"/>
+              </w:rPr>
+              <w:t xml:space="preserve">Cztery procesy</w:t>
+            </w:r>
+          </w:p>
+        </w:tc>
+        <w:tc>
+          <w:tcPr>
+            <w:tcW w:type="dxa" w:w="3000"/>
+            <w:tcMar>
+              <w:top w:type="dxa" w:w="70"/>
+              <w:left w:type="dxa" w:w="110"/>
+              <w:bottom w:type="dxa" w:w="70"/>
+              <w:right w:type="dxa" w:w="110"/>
+            </w:tcMar>
+          </w:tcPr>
+          <w:p>
+            <w:pPr>
+              <w:spacing w:after="0" w:line="240"/>
+            </w:pPr>
+            <w:r>
+              <w:rPr>
+                <w:sz w:val="19"/>
+                <w:szCs w:val="19"/>
+              </w:rPr>
+              <w:t xml:space="preserve">3266 rekordów/s — 3,6×</w:t>
+            </w:r>
+          </w:p>
+        </w:tc>
+        <w:tc>
+          <w:tcPr>
+            <w:tcW w:type="dxa" w:w="3426"/>
+            <w:tcMar>
+              <w:top w:type="dxa" w:w="70"/>
+              <w:left w:type="dxa" w:w="110"/>
+              <w:bottom w:type="dxa" w:w="70"/>
+              <w:right w:type="dxa" w:w="110"/>
+            </w:tcMar>
+          </w:tcPr>
+          <w:p>
+            <w:pPr>
+              <w:spacing w:after="0" w:line="240"/>
+            </w:pPr>
+            <w:r>
+              <w:rPr>
+                <w:sz w:val="19"/>
+                <w:szCs w:val="19"/>
+              </w:rPr>
+              <w:t xml:space="preserve">~1–1,5 godziny</w:t>
+            </w:r>
+          </w:p>
+        </w:tc>
+      </w:tr>
+    </w:tbl>
+    <w:p>
+      <w:pPr>
+        <w:spacing w:after="160"/>
+      </w:pPr>
     </w:p>
     <w:p>
       <w:pPr>
@@ -10324,7 +12082,16 @@
           <w:sz w:val="21"/>
           <w:szCs w:val="21"/>
         </w:rPr>
-        <w:t xml:space="preserve">Błędne wiązanie punktów z miejscowościami w nowej strukturze. W strukturze dotychczasowej punkt wskazywał miejscowość wprost jej identyfikatorem SIMC. W nowej wskazuje ją odwołaniem do obiektu, a identyfikator SIMC jest dopiero w tym obiekcie. Procedura wiążąca wyłuskiwała z takiego odwołania wszystkie cyfry — razem z cyframi daty wersji — i budowała z nich trzydziestoznakowy ciąg, który wygrywał z poprawnym identyfikatorem. Publikacja przerywała się błędem zapisu. Gdyby kolumna była szersza, do bazy trafiłyby ciche śmieci zamiast identyfikatorów miejscowości. To jest ta „korekta odwzorowania pól”, którą plan prac przewidywał dla nowej struktury.</w:t>
+        <w:t xml:space="preserve">Kosztem jest pamięć: około 400 MB na proces. Liczbę procesów dobiera się do pamięci dostępnej dla zadania, nie do liczby rdzeni.</w:t>
+      </w:r>
+    </w:p>
+    <w:p>
+      <w:pPr>
+        <w:pStyle w:val="Heading2"/>
+        <w:spacing w:after="140" w:before="280"/>
+      </w:pPr>
+      <w:r>
+        <w:t xml:space="preserve">8.6. Czasy odpowiedzi — sprostowanie</w:t>
       </w:r>
     </w:p>
     <w:p>
@@ -10336,17 +12103,377 @@
           <w:sz w:val="21"/>
           <w:szCs w:val="21"/>
         </w:rPr>
-        <w:t xml:space="preserve">Czas importu słowników TERYT. Pierwotnie rekordy wstawiane były pojedynczo, co przy 400 tys. pozycji trwało ponad 20 minut i zakończyło się zerwaniem połączenia oraz wycofaniem całej transakcji. Po przejściu na ładowanie masowe import trwa około 8 minut i kończy się powodzeniem.</w:t>
-      </w:r>
-    </w:p>
-    <w:p>
-      <w:pPr>
-        <w:pStyle w:val="Heading2"/>
-        <w:spacing w:after="140" w:before="280"/>
-      </w:pPr>
-      <w:r>
-        <w:t xml:space="preserve">8.5. Wydajność przetwarzania na pełnym zbiorze</w:t>
-      </w:r>
+        <w:t xml:space="preserve">Podane wcześniej 0,49 ms mediany pochodziło ze zbioru syntetycznego. Pomiar na danych rzeczywistych daje inny obraz.</w:t>
+      </w:r>
+    </w:p>
+    <w:tbl>
+      <w:tblPr>
+        <w:tblW w:type="dxa" w:w="9026"/>
+        <w:tblBorders>
+          <w:top w:val="single" w:color="auto" w:sz="4"/>
+          <w:left w:val="single" w:color="auto" w:sz="4"/>
+          <w:bottom w:val="single" w:color="auto" w:sz="4"/>
+          <w:right w:val="single" w:color="auto" w:sz="4"/>
+          <w:insideH w:val="single" w:color="auto" w:sz="4"/>
+          <w:insideV w:val="single" w:color="auto" w:sz="4"/>
+        </w:tblBorders>
+      </w:tblPr>
+      <w:tblGrid>
+        <w:gridCol w:w="5000"/>
+        <w:gridCol w:w="4026"/>
+      </w:tblGrid>
+      <w:tr>
+        <w:trPr>
+          <w:tblHeader/>
+        </w:trPr>
+        <w:tc>
+          <w:tcPr>
+            <w:tcW w:type="dxa" w:w="5000"/>
+            <w:shd w:fill="E8EDF2" w:color="auto" w:val="clear"/>
+            <w:tcMar>
+              <w:top w:type="dxa" w:w="70"/>
+              <w:left w:type="dxa" w:w="110"/>
+              <w:bottom w:type="dxa" w:w="70"/>
+              <w:right w:type="dxa" w:w="110"/>
+            </w:tcMar>
+            <w:vAlign w:val="center"/>
+          </w:tcPr>
+          <w:p>
+            <w:pPr>
+              <w:spacing w:after="0" w:line="240"/>
+            </w:pPr>
+            <w:r>
+              <w:rPr>
+                <w:b/>
+                <w:bCs/>
+                <w:sz w:val="19"/>
+                <w:szCs w:val="19"/>
+              </w:rPr>
+              <w:t xml:space="preserve">Rodzaj zapytania</w:t>
+            </w:r>
+          </w:p>
+        </w:tc>
+        <w:tc>
+          <w:tcPr>
+            <w:tcW w:type="dxa" w:w="4026"/>
+            <w:shd w:fill="E8EDF2" w:color="auto" w:val="clear"/>
+            <w:tcMar>
+              <w:top w:type="dxa" w:w="70"/>
+              <w:left w:type="dxa" w:w="110"/>
+              <w:bottom w:type="dxa" w:w="70"/>
+              <w:right w:type="dxa" w:w="110"/>
+            </w:tcMar>
+            <w:vAlign w:val="center"/>
+          </w:tcPr>
+          <w:p>
+            <w:pPr>
+              <w:spacing w:after="0" w:line="240"/>
+            </w:pPr>
+            <w:r>
+              <w:rPr>
+                <w:b/>
+                <w:bCs/>
+                <w:sz w:val="19"/>
+                <w:szCs w:val="19"/>
+              </w:rPr>
+              <w:t xml:space="preserve">Czas odpowiedzi</w:t>
+            </w:r>
+          </w:p>
+        </w:tc>
+      </w:tr>
+      <w:tr>
+        <w:tc>
+          <w:tcPr>
+            <w:tcW w:type="dxa" w:w="5000"/>
+            <w:tcMar>
+              <w:top w:type="dxa" w:w="70"/>
+              <w:left w:type="dxa" w:w="110"/>
+              <w:bottom w:type="dxa" w:w="70"/>
+              <w:right w:type="dxa" w:w="110"/>
+            </w:tcMar>
+          </w:tcPr>
+          <w:p>
+            <w:pPr>
+              <w:spacing w:after="0" w:line="240"/>
+            </w:pPr>
+            <w:r>
+              <w:rPr>
+                <w:sz w:val="19"/>
+                <w:szCs w:val="19"/>
+              </w:rPr>
+              <w:t xml:space="preserve">Nazwa jednoznaczna (Grójecka, Puławska)</w:t>
+            </w:r>
+          </w:p>
+        </w:tc>
+        <w:tc>
+          <w:tcPr>
+            <w:tcW w:type="dxa" w:w="4026"/>
+            <w:tcMar>
+              <w:top w:type="dxa" w:w="70"/>
+              <w:left w:type="dxa" w:w="110"/>
+              <w:bottom w:type="dxa" w:w="70"/>
+              <w:right w:type="dxa" w:w="110"/>
+            </w:tcMar>
+          </w:tcPr>
+          <w:p>
+            <w:pPr>
+              <w:spacing w:after="0" w:line="240"/>
+            </w:pPr>
+            <w:r>
+              <w:rPr>
+                <w:sz w:val="19"/>
+                <w:szCs w:val="19"/>
+              </w:rPr>
+              <w:t xml:space="preserve">0,7–0,8 ms</w:t>
+            </w:r>
+          </w:p>
+        </w:tc>
+      </w:tr>
+      <w:tr>
+        <w:tc>
+          <w:tcPr>
+            <w:tcW w:type="dxa" w:w="5000"/>
+            <w:tcMar>
+              <w:top w:type="dxa" w:w="70"/>
+              <w:left w:type="dxa" w:w="110"/>
+              <w:bottom w:type="dxa" w:w="70"/>
+              <w:right w:type="dxa" w:w="110"/>
+            </w:tcMar>
+          </w:tcPr>
+          <w:p>
+            <w:pPr>
+              <w:spacing w:after="0" w:line="240"/>
+            </w:pPr>
+            <w:r>
+              <w:rPr>
+                <w:sz w:val="19"/>
+                <w:szCs w:val="19"/>
+              </w:rPr>
+              <w:t xml:space="preserve">Nazwa częsta (Polna, 3 Maja, Krakowska)</w:t>
+            </w:r>
+          </w:p>
+        </w:tc>
+        <w:tc>
+          <w:tcPr>
+            <w:tcW w:type="dxa" w:w="4026"/>
+            <w:tcMar>
+              <w:top w:type="dxa" w:w="70"/>
+              <w:left w:type="dxa" w:w="110"/>
+              <w:bottom w:type="dxa" w:w="70"/>
+              <w:right w:type="dxa" w:w="110"/>
+            </w:tcMar>
+          </w:tcPr>
+          <w:p>
+            <w:pPr>
+              <w:spacing w:after="0" w:line="240"/>
+            </w:pPr>
+            <w:r>
+              <w:rPr>
+                <w:sz w:val="19"/>
+                <w:szCs w:val="19"/>
+              </w:rPr>
+              <w:t xml:space="preserve">2,6–4,8 ms</w:t>
+            </w:r>
+          </w:p>
+        </w:tc>
+      </w:tr>
+      <w:tr>
+        <w:tc>
+          <w:tcPr>
+            <w:tcW w:type="dxa" w:w="5000"/>
+            <w:tcMar>
+              <w:top w:type="dxa" w:w="70"/>
+              <w:left w:type="dxa" w:w="110"/>
+              <w:bottom w:type="dxa" w:w="70"/>
+              <w:right w:type="dxa" w:w="110"/>
+            </w:tcMar>
+          </w:tcPr>
+          <w:p>
+            <w:pPr>
+              <w:spacing w:after="0" w:line="240"/>
+            </w:pPr>
+            <w:r>
+              <w:rPr>
+                <w:sz w:val="19"/>
+                <w:szCs w:val="19"/>
+              </w:rPr>
+              <w:t xml:space="preserve">Nazwa patronacka (Kościuszki)</w:t>
+            </w:r>
+          </w:p>
+        </w:tc>
+        <w:tc>
+          <w:tcPr>
+            <w:tcW w:type="dxa" w:w="4026"/>
+            <w:tcMar>
+              <w:top w:type="dxa" w:w="70"/>
+              <w:left w:type="dxa" w:w="110"/>
+              <w:bottom w:type="dxa" w:w="70"/>
+              <w:right w:type="dxa" w:w="110"/>
+            </w:tcMar>
+          </w:tcPr>
+          <w:p>
+            <w:pPr>
+              <w:spacing w:after="0" w:line="240"/>
+            </w:pPr>
+            <w:r>
+              <w:rPr>
+                <w:sz w:val="19"/>
+                <w:szCs w:val="19"/>
+              </w:rPr>
+              <w:t xml:space="preserve">14 ms</w:t>
+            </w:r>
+          </w:p>
+        </w:tc>
+      </w:tr>
+      <w:tr>
+        <w:tc>
+          <w:tcPr>
+            <w:tcW w:type="dxa" w:w="5000"/>
+            <w:tcMar>
+              <w:top w:type="dxa" w:w="70"/>
+              <w:left w:type="dxa" w:w="110"/>
+              <w:bottom w:type="dxa" w:w="70"/>
+              <w:right w:type="dxa" w:w="110"/>
+            </w:tcMar>
+          </w:tcPr>
+          <w:p>
+            <w:pPr>
+              <w:spacing w:after="0" w:line="240"/>
+            </w:pPr>
+            <w:r>
+              <w:rPr>
+                <w:sz w:val="19"/>
+                <w:szCs w:val="19"/>
+              </w:rPr>
+              <w:t xml:space="preserve">Zapytanie z literówką (mickievicza)</w:t>
+            </w:r>
+          </w:p>
+        </w:tc>
+        <w:tc>
+          <w:tcPr>
+            <w:tcW w:type="dxa" w:w="4026"/>
+            <w:tcMar>
+              <w:top w:type="dxa" w:w="70"/>
+              <w:left w:type="dxa" w:w="110"/>
+              <w:bottom w:type="dxa" w:w="70"/>
+              <w:right w:type="dxa" w:w="110"/>
+            </w:tcMar>
+          </w:tcPr>
+          <w:p>
+            <w:pPr>
+              <w:spacing w:after="0" w:line="240"/>
+            </w:pPr>
+            <w:r>
+              <w:rPr>
+                <w:sz w:val="19"/>
+                <w:szCs w:val="19"/>
+              </w:rPr>
+              <w:t xml:space="preserve">27 ms</w:t>
+            </w:r>
+          </w:p>
+        </w:tc>
+      </w:tr>
+      <w:tr>
+        <w:tc>
+          <w:tcPr>
+            <w:tcW w:type="dxa" w:w="5000"/>
+            <w:tcMar>
+              <w:top w:type="dxa" w:w="70"/>
+              <w:left w:type="dxa" w:w="110"/>
+              <w:bottom w:type="dxa" w:w="70"/>
+              <w:right w:type="dxa" w:w="110"/>
+            </w:tcMar>
+          </w:tcPr>
+          <w:p>
+            <w:pPr>
+              <w:spacing w:after="0" w:line="240"/>
+            </w:pPr>
+            <w:r>
+              <w:rPr>
+                <w:sz w:val="19"/>
+                <w:szCs w:val="19"/>
+              </w:rPr>
+              <w:t xml:space="preserve">Nazwa masowo powtarzalna (Nowa Wieś)</w:t>
+            </w:r>
+          </w:p>
+        </w:tc>
+        <w:tc>
+          <w:tcPr>
+            <w:tcW w:type="dxa" w:w="4026"/>
+            <w:tcMar>
+              <w:top w:type="dxa" w:w="70"/>
+              <w:left w:type="dxa" w:w="110"/>
+              <w:bottom w:type="dxa" w:w="70"/>
+              <w:right w:type="dxa" w:w="110"/>
+            </w:tcMar>
+          </w:tcPr>
+          <w:p>
+            <w:pPr>
+              <w:spacing w:after="0" w:line="240"/>
+            </w:pPr>
+            <w:r>
+              <w:rPr>
+                <w:sz w:val="19"/>
+                <w:szCs w:val="19"/>
+              </w:rPr>
+              <w:t xml:space="preserve">42 ms</w:t>
+            </w:r>
+          </w:p>
+        </w:tc>
+      </w:tr>
+      <w:tr>
+        <w:tc>
+          <w:tcPr>
+            <w:tcW w:type="dxa" w:w="5000"/>
+            <w:tcMar>
+              <w:top w:type="dxa" w:w="70"/>
+              <w:left w:type="dxa" w:w="110"/>
+              <w:bottom w:type="dxa" w:w="70"/>
+              <w:right w:type="dxa" w:w="110"/>
+            </w:tcMar>
+          </w:tcPr>
+          <w:p>
+            <w:pPr>
+              <w:spacing w:after="0" w:line="240"/>
+            </w:pPr>
+            <w:r>
+              <w:rPr>
+                <w:sz w:val="19"/>
+                <w:szCs w:val="19"/>
+              </w:rPr>
+              <w:t xml:space="preserve">Mediana</w:t>
+            </w:r>
+          </w:p>
+        </w:tc>
+        <w:tc>
+          <w:tcPr>
+            <w:tcW w:type="dxa" w:w="4026"/>
+            <w:tcMar>
+              <w:top w:type="dxa" w:w="70"/>
+              <w:left w:type="dxa" w:w="110"/>
+              <w:bottom w:type="dxa" w:w="70"/>
+              <w:right w:type="dxa" w:w="110"/>
+            </w:tcMar>
+          </w:tcPr>
+          <w:p>
+            <w:pPr>
+              <w:spacing w:after="0" w:line="240"/>
+            </w:pPr>
+            <w:r>
+              <w:rPr>
+                <w:sz w:val="19"/>
+                <w:szCs w:val="19"/>
+              </w:rPr>
+              <w:t xml:space="preserve">~4 ms</w:t>
+            </w:r>
+          </w:p>
+        </w:tc>
+      </w:tr>
+    </w:tbl>
+    <w:p>
+      <w:pPr>
+        <w:spacing w:after="160"/>
+      </w:pPr>
     </w:p>
     <w:p>
       <w:pPr>
@@ -10357,154 +12484,49 @@
           <w:sz w:val="21"/>
           <w:szCs w:val="21"/>
         </w:rPr>
-        <w:t xml:space="preserve">Pomiary wykonano na komputerze przenośnym (8 rdzeni, przetwarzanie w kontenerach, archiwum na dysku hosta). Na serwerze wyniki będą lepsze, ale proporcje pozostaną.</w:t>
-      </w:r>
-    </w:p>
-    <w:p>
-      <w:pPr>
-        <w:spacing w:after="120" w:line="276"/>
+        <w:t xml:space="preserve">Różnica nie wynika z wielkości zbioru, lecz z jego rozkładu: w prawdziwych danych „Nowa Wieś” to setki miejscowości, a nazwy patronackie powtarzają się w tysiącach. Koszt bierze się z liczby kandydatów do uszeregowania.</w:t>
+      </w:r>
+    </w:p>
+    <w:p>
+      <w:pPr>
+        <w:pBdr>
+          <w:top w:val="single" w:color="D5DBE0" w:sz="4"/>
+          <w:bottom w:val="single" w:color="D5DBE0" w:sz="0"/>
+          <w:left w:val="single" w:color="D5DBE0" w:sz="4"/>
+          <w:right w:val="single" w:color="D5DBE0" w:sz="4"/>
+        </w:pBdr>
+        <w:shd w:fill="FDF1E7" w:color="auto" w:val="clear"/>
+        <w:spacing w:after="0" w:before="160" w:line="276"/>
+        <w:ind w:left="120" w:right="120"/>
       </w:pPr>
       <w:r>
         <w:rPr>
+          <w:b/>
+          <w:bCs/>
           <w:sz w:val="21"/>
           <w:szCs w:val="21"/>
         </w:rPr>
-        <w:t xml:space="preserve">Parsowanie punktów adresowych osiąga 902 rekordy na sekundę; miejscowości i ulice są dwukrotnie wolniejsze, bo mają więcej pól na rekord. Załadowanie mazowieckiego zajęło około 38 minut, co dla całego kraju daje około 4 godzin — istotnie więcej niż wcześniej zakładane 40 minut. Ta rozbieżność została usunięta: ponieważ pliki wojewódzkie są od siebie niezależne, przetwarzanie rozdzielono na równoległe procesy. Cztery naraz dają łącznie 3266 rekordów na sekundę wobec 902 w jednym procesie, czyli 3,6-krotne przyspieszenie, co sprowadza pełny przebieg do około 1–1,5 godziny. Kosztem jest pamięć: około 400 MB na proces.</w:t>
-      </w:r>
-    </w:p>
-    <w:p>
-      <w:pPr>
-        <w:spacing w:after="120" w:line="276"/>
+        <w:t xml:space="preserve">Co to znaczy dla produktu</w:t>
+      </w:r>
+    </w:p>
+    <w:p>
+      <w:pPr>
+        <w:pBdr>
+          <w:top w:val="single" w:color="D5DBE0" w:sz="0"/>
+          <w:bottom w:val="single" w:color="D5DBE0" w:sz="4"/>
+          <w:left w:val="single" w:color="D5DBE0" w:sz="4"/>
+          <w:right w:val="single" w:color="D5DBE0" w:sz="4"/>
+        </w:pBdr>
+        <w:shd w:fill="FDF1E7" w:color="auto" w:val="clear"/>
+        <w:spacing w:after="160" w:line="276"/>
+        <w:ind w:left="120" w:right="120"/>
       </w:pPr>
       <w:r>
         <w:rPr>
-          <w:sz w:val="21"/>
-          <w:szCs w:val="21"/>
+          <w:sz w:val="20"/>
+          <w:szCs w:val="20"/>
         </w:rPr>
-        <w:t xml:space="preserve">Wniosek dla harmonogramu: przy aktualizacji dobowej pełny przebieg mieści się w oknie nocnym z dużym zapasem. Wartość zrównoleglenia dobiera się do pamięci dostępnej dla zadania, a nie do liczby rdzeni.</w:t>
-      </w:r>
-    </w:p>
-    <w:p>
-      <w:pPr>
-        <w:pStyle w:val="Heading2"/>
-        <w:spacing w:after="140" w:before="280"/>
-      </w:pPr>
-      <w:r>
-        <w:t xml:space="preserve">8.6. Publikacja na danych rzeczywistych — wynik</w:t>
-      </w:r>
-    </w:p>
-    <w:p>
-      <w:pPr>
-        <w:spacing w:after="120" w:line="276"/>
-      </w:pPr>
-      <w:r>
-        <w:rPr>
-          <w:sz w:val="21"/>
-          <w:szCs w:val="21"/>
-        </w:rPr>
-        <w:t xml:space="preserve">Cała ścieżka została doprowadzona do końca: dane czterech województw przeszły kontrole jakości, zostały opublikowane transakcyjnie, artefakt wyszukiwania zbudowano z prawdziwych danych, a mikroserwis odpowiada na zapytania.</w:t>
-      </w:r>
-    </w:p>
-    <w:p>
-      <w:pPr>
-        <w:spacing w:after="120" w:line="276"/>
-      </w:pPr>
-      <w:r>
-        <w:rPr>
-          <w:sz w:val="21"/>
-          <w:szCs w:val="21"/>
-        </w:rPr>
-        <w:t xml:space="preserve">Opublikowano 1 990 483 punkty adresowe. Ulicę udało się przypisać 1 324 563 punktom — to dokładnie tyle, ile miało w źródle odwołanie do ulicy, czyli wiązanie zadziałało bez ani jednej straty. Pozostałe punkty to adresy wiejskie, gdzie numer odnosi się wprost do miejscowości. Katalog ulic urósł do 385 436 pozycji: 308 888 pochodzi z TERYT, resztę wniósł rejestr PRG. Artefakt wyszukiwania objął 487 301 pozycji i zajął 66,4 MB.</w:t>
-      </w:r>
-    </w:p>
-    <w:p>
-      <w:pPr>
-        <w:spacing w:after="120" w:line="276"/>
-      </w:pPr>
-      <w:r>
-        <w:rPr>
-          <w:sz w:val="21"/>
-          <w:szCs w:val="21"/>
-        </w:rPr>
-        <w:t xml:space="preserve">Publikacja czterech województw trwała 72 minuty. Dla całego kraju będzie to proporcjonalnie więcej, ale nie liniowo — znaczna część tego czasu to jednorazowe zapełnienie pustych tabel i indeksów.</w:t>
-      </w:r>
-    </w:p>
-    <w:p>
-      <w:pPr>
-        <w:pStyle w:val="Heading2"/>
-        <w:spacing w:after="140" w:before="280"/>
-      </w:pPr>
-      <w:r>
-        <w:t xml:space="preserve">8.7. Usterki wykryte podczas publikacji</w:t>
-      </w:r>
-    </w:p>
-    <w:p>
-      <w:pPr>
-        <w:spacing w:after="120" w:line="276"/>
-      </w:pPr>
-      <w:r>
-        <w:rPr>
-          <w:sz w:val="21"/>
-          <w:szCs w:val="21"/>
-        </w:rPr>
-        <w:t xml:space="preserve">Poza trzema opisanymi wcześniej, publikacja ujawniła dwie kolejne. Obie były niewidoczne dopóki nie zadziałała poprawka poprzedniej — to typowe dla warstwowych usterek w przetwarzaniu danych i najmocniejszy argument za tym, żeby przed produkcją przepuścić przez potok pełny zbiór, a nie próbkę.</w:t>
-      </w:r>
-    </w:p>
-    <w:p>
-      <w:pPr>
-        <w:spacing w:after="120" w:line="276"/>
-      </w:pPr>
-      <w:r>
-        <w:rPr>
-          <w:sz w:val="21"/>
-          <w:szCs w:val="21"/>
-        </w:rPr>
-        <w:t xml:space="preserve">Zdublowane pozycje w słownikach. Źródło opisuje część ulic i miejscowości więcej niż raz. Zapis do bazy przerywał się wtedy błędem, bo ten sam klucz trafiał dwukrotnie w jednej operacji — jeden zdublowany rekord wstrzymywał publikację całego kraju. W jednym zrzucie było 329 takich grup ulic. Rozstrzyganie duplikatów jest teraz jawne i powtarzalne: dla miejscowości wygrywa wariant z geometrią, dla ulic wariant z identyfikatorem z katalogu ULIC. Powtarzalność jest tu istotna, bo na niej opiera się możliwość automatycznego porównywania kolejnych wersji artefaktu wyszukiwania.</w:t>
-      </w:r>
-    </w:p>
-    <w:p>
-      <w:pPr>
-        <w:spacing w:after="120" w:line="276"/>
-      </w:pPr>
-      <w:r>
-        <w:rPr>
-          <w:sz w:val="21"/>
-          <w:szCs w:val="21"/>
-        </w:rPr>
-        <w:t xml:space="preserve">Zapytanie wiążące punkty z ulicami nie miało szans się zakończyć. Warunek łączył przez „lub” porównanie po kolumnie z porównaniem po wyniku funkcji, przez co baza nie mogła użyć indeksu i dla każdego punktu przeglądała wszystkie ulice: 1 324 563 punkty razy 76 886 ulic, ponad sto miliardów porównań. Przebieg został przerwany po ośmiu godzinach bez wyniku. Po rozdzieleniu warunku na dwa zapytania ten sam krok wykonuje się w minutach. Warto odnotować, że na danych testowych liczących kilkanaście rekordów taki błąd jest całkowicie niewidoczny.</w:t>
-      </w:r>
-    </w:p>
-    <w:p>
-      <w:pPr>
-        <w:pStyle w:val="Heading2"/>
-        <w:spacing w:after="140" w:before="280"/>
-      </w:pPr>
-      <w:r>
-        <w:t xml:space="preserve">8.8. Sprostowanie: czasy odpowiedzi na danych rzeczywistych</w:t>
-      </w:r>
-    </w:p>
-    <w:p>
-      <w:pPr>
-        <w:spacing w:after="120" w:line="276"/>
-      </w:pPr>
-      <w:r>
-        <w:rPr>
-          <w:sz w:val="21"/>
-          <w:szCs w:val="21"/>
-        </w:rPr>
-        <w:t xml:space="preserve">Podane wcześniej 0,49 ms mediany pochodziło ze zbioru syntetycznego. Na danych rzeczywistych mediana wynosi około 4 ms, a najwolniejsze zapytania sięgają 42 ms. Różnica nie bierze się z wielkości zbioru, lecz z jego rozkładu: w prawdziwych danych „Nowa Wieś” to setki miejscowości, a nazwy patronackie w rodzaju „Kościuszki” występują w tysiącach miejscowości. Koszt wynika z liczby kandydatów do uszeregowania, a nie z rozmiaru indeksu.</w:t>
-      </w:r>
-    </w:p>
-    <w:p>
-      <w:pPr>
-        <w:spacing w:after="120" w:line="276"/>
-      </w:pPr>
-      <w:r>
-        <w:rPr>
-          <w:sz w:val="21"/>
-          <w:szCs w:val="21"/>
-        </w:rPr>
-        <w:t xml:space="preserve">Dla zastosowania produktowego jest to nadal wynik bardzo dobry — podpowiedzi pozostają natychmiastowe w odbiorze użytkownika, a najgorszy zmierzony przypadek mieści się w typowym budżecie czasu odpowiedzi z dużym zapasem. Wniosek dla planowania: zapytania jednoznaczne kosztują poniżej milisekundy, a budżet trzeba przewidzieć pod nazwy pospolite i zapytania z literówką.</w:t>
+        <w:t xml:space="preserve">Wynik pozostaje bardzo dobry — podpowiedzi są dla użytkownika natychmiastowe, a najgorszy zmierzony przypadek mieści się w typowym budżecie czasu odpowiedzi z dużym zapasem. Planując wydajność, budżet należy przewidzieć pod nazwy pospolite i zapytania z literówką, nie pod przypadek optymistyczny.</w:t>
       </w:r>
     </w:p>
     <w:p>

</xml_diff>